<commit_message>
docs: add annotated role guides
</commit_message>
<xml_diff>
--- a/project_files/deliverables/Инструкция_для_логистов_и_администраторов.docx
+++ b/project_files/deliverables/Инструкция_для_логистов_и_администраторов.docx
@@ -8,9 +8,9 @@
       </w:pPr>
       <w:r>
         <w:rPr>
-          <w:rFonts w:ascii="Arial" w:hAnsi="Arial" w:eastAsia="Arial"/>
+          <w:rFonts w:ascii="Arial" w:hAnsi="Arial"/>
           <w:b/>
-          <w:color w:val="FF4B18"/>
+          <w:color w:val="FF4B1F"/>
           <w:sz w:val="18"/>
         </w:rPr>
         <w:t>ПОЛЬЗОВАТЕЛЬСКАЯ ИНСТРУКЦИЯ</w:t>
@@ -19,60 +19,40 @@
     <w:p>
       <w:pPr>
         <w:pStyle w:val="Title"/>
+        <w:spacing w:after="160"/>
       </w:pPr>
       <w:r>
-        <w:t>Инструкция для логистов и администраторов</w:t>
+        <w:t>Работа со списком транспорта</w:t>
+        <w:br/>
+        <w:t>и пользователями</w:t>
+      </w:r>
+    </w:p>
+    <w:p>
+      <w:r>
+        <w:rPr>
+          <w:color w:val="696969"/>
+          <w:sz w:val="32"/>
+        </w:rPr>
+        <w:t>Краткое руководство для логистов и администраторов</w:t>
       </w:r>
     </w:p>
     <w:p>
       <w:pPr>
-        <w:spacing w:after="260"/>
+        <w:spacing w:after="180"/>
+        <w:pBdr>
+          <w:bottom w:val="single" w:sz="20" w:color="FF4B1F"/>
+        </w:pBdr>
       </w:pPr>
-      <w:r>
-        <w:rPr>
-          <w:rFonts w:ascii="Arial" w:hAnsi="Arial" w:eastAsia="Arial"/>
-          <w:b/>
-          <w:color w:val="292727"/>
-          <w:sz w:val="24"/>
-        </w:rPr>
-        <w:t>Сервис пропусков ЗТЗ</w:t>
-      </w:r>
-    </w:p>
-    <w:p>
-      <w:pPr>
-        <w:spacing w:after="240"/>
-      </w:pPr>
-      <w:r>
-        <w:t>Эта памятка помогает сотрудникам работать с заявками водителей. Логист обрабатывает список транспортных средств. Администратор выполняет те же действия, а также управляет пользователями и настройками водительского киоска.</w:t>
-      </w:r>
-    </w:p>
-    <w:p>
-      <w:pPr>
-        <w:pStyle w:val="Heading1"/>
-      </w:pPr>
-      <w:r>
-        <w:t>Какие разделы доступны</w:t>
-      </w:r>
     </w:p>
     <w:tbl>
       <w:tblPr>
         <w:tblW w:type="auto" w:w="0"/>
         <w:jc w:val="center"/>
-        <w:tblLayout w:type="fixed"/>
         <w:tblLook w:firstColumn="1" w:firstRow="1" w:lastColumn="0" w:lastRow="0" w:noHBand="0" w:noVBand="1" w:val="04A0"/>
-        <w:tblBorders>
-          <w:top w:val="single" w:sz="6" w:color="D9D9D9"/>
-          <w:left w:val="single" w:sz="6" w:color="D9D9D9"/>
-          <w:bottom w:val="single" w:sz="6" w:color="D9D9D9"/>
-          <w:right w:val="single" w:sz="6" w:color="D9D9D9"/>
-          <w:insideH w:val="single" w:sz="6" w:color="D9D9D9"/>
-          <w:insideV w:val="single" w:sz="6" w:color="D9D9D9"/>
-        </w:tblBorders>
       </w:tblPr>
       <w:tblGrid>
-        <w:gridCol w:w="1757"/>
-        <w:gridCol w:w="2952"/>
-        <w:gridCol w:w="5400"/>
+        <w:gridCol w:w="7569"/>
+        <w:gridCol w:w="7569"/>
       </w:tblGrid>
       <w:tr>
         <w:trPr>
@@ -80,243 +60,107 @@
         </w:trPr>
         <w:tc>
           <w:tcPr>
-            <w:tcW w:type="dxa" w:w="3389"/>
-            <w:shd w:fill="292727"/>
-            <w:tcMar>
-              <w:top w:w="110" w:type="dxa"/>
-              <w:start w:w="130" w:type="dxa"/>
-              <w:bottom w:w="110" w:type="dxa"/>
-              <w:end w:w="130" w:type="dxa"/>
-            </w:tcMar>
-            <w:vAlign w:val="center"/>
+            <w:tcW w:type="dxa" w:w="7569"/>
+            <w:shd w:fill="F5F3F1"/>
+            <w:vAlign w:val="top"/>
           </w:tcPr>
           <w:p>
             <w:r>
               <w:rPr>
-                <w:rFonts w:ascii="Arial" w:hAnsi="Arial" w:eastAsia="Arial"/>
                 <w:b/>
-                <w:color w:val="FFFFFF"/>
-                <w:sz w:val="19"/>
+                <w:color w:val="FF4B1F"/>
+                <w:sz w:val="30"/>
               </w:rPr>
-              <w:t>Роль</w:t>
+              <w:t>LOGIST</w:t>
+            </w:r>
+          </w:p>
+          <w:p>
+            <w:pPr>
+              <w:pStyle w:val="ListBullet"/>
+              <w:spacing w:after="80"/>
+            </w:pPr>
+            <w:r>
+              <w:t>Просматривает обращения водителей.</w:t>
+            </w:r>
+          </w:p>
+          <w:p>
+            <w:pPr>
+              <w:pStyle w:val="ListBullet"/>
+              <w:spacing w:after="80"/>
+            </w:pPr>
+            <w:r>
+              <w:t>Ищет и фильтрует транспорт.</w:t>
+            </w:r>
+          </w:p>
+          <w:p>
+            <w:pPr>
+              <w:pStyle w:val="ListBullet"/>
+              <w:spacing w:after="80"/>
+            </w:pPr>
+            <w:r>
+              <w:t>Скрывает обработанные записи и возвращает их.</w:t>
+            </w:r>
+          </w:p>
+          <w:p>
+            <w:pPr>
+              <w:pStyle w:val="ListBullet"/>
+              <w:spacing w:after="80"/>
+            </w:pPr>
+            <w:r>
+              <w:t>Выгружает список в Excel.</w:t>
             </w:r>
           </w:p>
         </w:tc>
         <w:tc>
           <w:tcPr>
-            <w:tcW w:type="dxa" w:w="3389"/>
-            <w:shd w:fill="292727"/>
-            <w:tcMar>
-              <w:top w:w="110" w:type="dxa"/>
-              <w:start w:w="130" w:type="dxa"/>
-              <w:bottom w:w="110" w:type="dxa"/>
-              <w:end w:w="130" w:type="dxa"/>
-            </w:tcMar>
-            <w:vAlign w:val="center"/>
+            <w:tcW w:type="dxa" w:w="7569"/>
+            <w:shd w:fill="F5F3F1"/>
+            <w:vAlign w:val="top"/>
           </w:tcPr>
           <w:p>
             <w:r>
               <w:rPr>
-                <w:rFonts w:ascii="Arial" w:hAnsi="Arial" w:eastAsia="Arial"/>
                 <w:b/>
-                <w:color w:val="FFFFFF"/>
-                <w:sz w:val="19"/>
+                <w:color w:val="FF4B1F"/>
+                <w:sz w:val="30"/>
               </w:rPr>
-              <w:t>Разделы</w:t>
+              <w:t>ADMINISTRATOR</w:t>
             </w:r>
           </w:p>
-        </w:tc>
-        <w:tc>
-          <w:tcPr>
-            <w:tcW w:type="dxa" w:w="3389"/>
-            <w:shd w:fill="292727"/>
-            <w:tcMar>
-              <w:top w:w="110" w:type="dxa"/>
-              <w:start w:w="130" w:type="dxa"/>
-              <w:bottom w:w="110" w:type="dxa"/>
-              <w:end w:w="130" w:type="dxa"/>
-            </w:tcMar>
-            <w:vAlign w:val="center"/>
-          </w:tcPr>
           <w:p>
+            <w:pPr>
+              <w:pStyle w:val="ListBullet"/>
+              <w:spacing w:after="80"/>
+            </w:pPr>
             <w:r>
-              <w:rPr>
-                <w:rFonts w:ascii="Arial" w:hAnsi="Arial" w:eastAsia="Arial"/>
-                <w:b/>
-                <w:color w:val="FFFFFF"/>
-                <w:sz w:val="19"/>
-              </w:rPr>
-              <w:t>Что можно делать</w:t>
+              <w:t>Выполняет все действия логиста.</w:t>
             </w:r>
           </w:p>
-        </w:tc>
-      </w:tr>
-      <w:tr>
-        <w:tc>
-          <w:tcPr>
-            <w:tcW w:type="dxa" w:w="1757"/>
-            <w:shd w:fill="FFF2EC"/>
-            <w:tcMar>
-              <w:top w:w="120" w:type="dxa"/>
-              <w:start w:w="130" w:type="dxa"/>
-              <w:bottom w:w="120" w:type="dxa"/>
-              <w:end w:w="130" w:type="dxa"/>
-            </w:tcMar>
-            <w:vAlign w:val="center"/>
-          </w:tcPr>
           <w:p>
             <w:pPr>
-              <w:spacing w:after="0"/>
+              <w:pStyle w:val="ListBullet"/>
+              <w:spacing w:after="80"/>
             </w:pPr>
             <w:r>
-              <w:rPr>
-                <w:rFonts w:ascii="Arial" w:hAnsi="Arial" w:eastAsia="Arial"/>
-                <w:b/>
-                <w:color w:val="292727"/>
-                <w:sz w:val="19"/>
-              </w:rPr>
-              <w:t>Логист</w:t>
+              <w:t>Создаёт и включает/отключает пользователей.</w:t>
             </w:r>
           </w:p>
-        </w:tc>
-        <w:tc>
-          <w:tcPr>
-            <w:tcW w:type="dxa" w:w="2952"/>
-            <w:shd w:fill="FFF2EC"/>
-            <w:tcMar>
-              <w:top w:w="120" w:type="dxa"/>
-              <w:start w:w="130" w:type="dxa"/>
-              <w:bottom w:w="120" w:type="dxa"/>
-              <w:end w:w="130" w:type="dxa"/>
-            </w:tcMar>
-            <w:vAlign w:val="center"/>
-          </w:tcPr>
           <w:p>
             <w:pPr>
-              <w:spacing w:after="0"/>
+              <w:pStyle w:val="ListBullet"/>
+              <w:spacing w:after="80"/>
             </w:pPr>
             <w:r>
-              <w:rPr>
-                <w:rFonts w:ascii="Arial" w:hAnsi="Arial" w:eastAsia="Arial"/>
-                <w:b w:val="0"/>
-                <w:color w:val="292727"/>
-                <w:sz w:val="19"/>
-              </w:rPr>
-              <w:t>Транспорт</w:t>
+              <w:t>Меняет пользователям пароли.</w:t>
             </w:r>
           </w:p>
-        </w:tc>
-        <w:tc>
-          <w:tcPr>
-            <w:tcW w:type="dxa" w:w="5400"/>
-            <w:shd w:fill="FFF2EC"/>
-            <w:tcMar>
-              <w:top w:w="120" w:type="dxa"/>
-              <w:start w:w="130" w:type="dxa"/>
-              <w:bottom w:w="120" w:type="dxa"/>
-              <w:end w:w="130" w:type="dxa"/>
-            </w:tcMar>
-            <w:vAlign w:val="center"/>
-          </w:tcPr>
           <w:p>
             <w:pPr>
-              <w:spacing w:after="0"/>
+              <w:pStyle w:val="ListBullet"/>
+              <w:spacing w:after="80"/>
             </w:pPr>
             <w:r>
-              <w:rPr>
-                <w:rFonts w:ascii="Arial" w:hAnsi="Arial" w:eastAsia="Arial"/>
-                <w:b w:val="0"/>
-                <w:color w:val="292727"/>
-                <w:sz w:val="19"/>
-              </w:rPr>
-              <w:t>Искать и фильтровать записи, скрывать обработанные записи, возвращать их в работу и выгружать список в Excel.</w:t>
-            </w:r>
-          </w:p>
-        </w:tc>
-      </w:tr>
-      <w:tr>
-        <w:tc>
-          <w:tcPr>
-            <w:tcW w:type="dxa" w:w="1757"/>
-            <w:shd w:fill="F5F4F3"/>
-            <w:tcMar>
-              <w:top w:w="120" w:type="dxa"/>
-              <w:start w:w="130" w:type="dxa"/>
-              <w:bottom w:w="120" w:type="dxa"/>
-              <w:end w:w="130" w:type="dxa"/>
-            </w:tcMar>
-            <w:vAlign w:val="center"/>
-          </w:tcPr>
-          <w:p>
-            <w:pPr>
-              <w:spacing w:after="0"/>
-            </w:pPr>
-            <w:r>
-              <w:rPr>
-                <w:rFonts w:ascii="Arial" w:hAnsi="Arial" w:eastAsia="Arial"/>
-                <w:b/>
-                <w:color w:val="292727"/>
-                <w:sz w:val="19"/>
-              </w:rPr>
-              <w:t>Администратор</w:t>
-            </w:r>
-          </w:p>
-        </w:tc>
-        <w:tc>
-          <w:tcPr>
-            <w:tcW w:type="dxa" w:w="2952"/>
-            <w:shd w:fill="F5F4F3"/>
-            <w:tcMar>
-              <w:top w:w="120" w:type="dxa"/>
-              <w:start w:w="130" w:type="dxa"/>
-              <w:bottom w:w="120" w:type="dxa"/>
-              <w:end w:w="130" w:type="dxa"/>
-            </w:tcMar>
-            <w:vAlign w:val="center"/>
-          </w:tcPr>
-          <w:p>
-            <w:pPr>
-              <w:spacing w:after="0"/>
-            </w:pPr>
-            <w:r>
-              <w:rPr>
-                <w:rFonts w:ascii="Arial" w:hAnsi="Arial" w:eastAsia="Arial"/>
-                <w:b w:val="0"/>
-                <w:color w:val="292727"/>
-                <w:sz w:val="19"/>
-              </w:rPr>
-              <w:t>Транспорт</w:t>
-              <w:br/>
-              <w:t>Пользователи</w:t>
-              <w:br/>
-              <w:t>Настройки</w:t>
-            </w:r>
-          </w:p>
-        </w:tc>
-        <w:tc>
-          <w:tcPr>
-            <w:tcW w:type="dxa" w:w="5400"/>
-            <w:shd w:fill="F5F4F3"/>
-            <w:tcMar>
-              <w:top w:w="120" w:type="dxa"/>
-              <w:start w:w="130" w:type="dxa"/>
-              <w:bottom w:w="120" w:type="dxa"/>
-              <w:end w:w="130" w:type="dxa"/>
-            </w:tcMar>
-            <w:vAlign w:val="center"/>
-          </w:tcPr>
-          <w:p>
-            <w:pPr>
-              <w:spacing w:after="0"/>
-            </w:pPr>
-            <w:r>
-              <w:rPr>
-                <w:rFonts w:ascii="Arial" w:hAnsi="Arial" w:eastAsia="Arial"/>
-                <w:b w:val="0"/>
-                <w:color w:val="292727"/>
-                <w:sz w:val="19"/>
-              </w:rPr>
-              <w:t>Работать с транспортом, создавать и отключать пользователей, менять пароли, настраивать тему и тексты водительского киоска.</w:t>
+              <w:t>Настраивает тему и тексты водительского киоска.</w:t>
             </w:r>
           </w:p>
         </w:tc>
@@ -324,588 +168,63 @@
     </w:tbl>
     <w:p>
       <w:pPr>
-        <w:pStyle w:val="Heading1"/>
+        <w:pStyle w:val="Heading2"/>
       </w:pPr>
       <w:r>
-        <w:t>Вход и общие действия</w:t>
+        <w:t>Вход в кабинет</w:t>
       </w:r>
     </w:p>
     <w:p>
       <w:pPr>
-        <w:spacing w:after="110"/>
-        <w:ind w:left="547" w:hanging="547"/>
+        <w:spacing w:after="100"/>
       </w:pPr>
       <w:r>
         <w:rPr>
-          <w:rFonts w:ascii="Arial" w:hAnsi="Arial" w:eastAsia="Arial"/>
           <w:b/>
-          <w:color w:val="FF4B18"/>
-          <w:sz w:val="22"/>
+          <w:color w:val="FF4B1F"/>
         </w:rPr>
-        <w:t xml:space="preserve">1  </w:t>
+        <w:t xml:space="preserve">1.  </w:t>
       </w:r>
       <w:r>
-        <w:rPr>
-          <w:rFonts w:ascii="Arial" w:hAnsi="Arial" w:eastAsia="Arial"/>
-          <w:b/>
-          <w:color w:val="000000"/>
-          <w:sz w:val="22"/>
-        </w:rPr>
-        <w:t>Откройте страницу входа сотрудников</w:t>
-      </w:r>
-      <w:r>
-        <w:rPr>
-          <w:rFonts w:ascii="Arial" w:hAnsi="Arial" w:eastAsia="Arial"/>
-          <w:color w:val="292727"/>
-          <w:sz w:val="21"/>
-        </w:rPr>
-        <w:t>. Адрес страницы выдаёт ответственный за сервис.</w:t>
+        <w:t>Откройте служебную страницу входа по адресу, который выдал ответственный за сервис.</w:t>
       </w:r>
     </w:p>
     <w:p>
       <w:pPr>
-        <w:spacing w:after="110"/>
-        <w:ind w:left="547" w:hanging="547"/>
+        <w:spacing w:after="100"/>
       </w:pPr>
       <w:r>
         <w:rPr>
-          <w:rFonts w:ascii="Arial" w:hAnsi="Arial" w:eastAsia="Arial"/>
           <w:b/>
-          <w:color w:val="FF4B18"/>
-          <w:sz w:val="22"/>
+          <w:color w:val="FF4B1F"/>
         </w:rPr>
-        <w:t xml:space="preserve">2  </w:t>
+        <w:t xml:space="preserve">2.  </w:t>
       </w:r>
       <w:r>
-        <w:rPr>
-          <w:rFonts w:ascii="Arial" w:hAnsi="Arial" w:eastAsia="Arial"/>
-          <w:b/>
-          <w:color w:val="000000"/>
-          <w:sz w:val="22"/>
-        </w:rPr>
-        <w:t>Введите логин и пароль</w:t>
-      </w:r>
-      <w:r>
-        <w:rPr>
-          <w:rFonts w:ascii="Arial" w:hAnsi="Arial" w:eastAsia="Arial"/>
-          <w:color w:val="292727"/>
-          <w:sz w:val="21"/>
-        </w:rPr>
-        <w:t>. Используйте свою учётную запись и нажмите «Войти».</w:t>
+        <w:t>Введите свой логин и пароль, затем нажмите «Войти».</w:t>
       </w:r>
     </w:p>
     <w:p>
       <w:pPr>
-        <w:spacing w:after="110"/>
-        <w:ind w:left="547" w:hanging="547"/>
+        <w:spacing w:after="100"/>
       </w:pPr>
       <w:r>
         <w:rPr>
-          <w:rFonts w:ascii="Arial" w:hAnsi="Arial" w:eastAsia="Arial"/>
           <w:b/>
-          <w:color w:val="FF4B18"/>
-          <w:sz w:val="22"/>
+          <w:color w:val="FF4B1F"/>
         </w:rPr>
-        <w:t xml:space="preserve">3  </w:t>
+        <w:t xml:space="preserve">3.  </w:t>
       </w:r>
       <w:r>
-        <w:rPr>
-          <w:rFonts w:ascii="Arial" w:hAnsi="Arial" w:eastAsia="Arial"/>
-          <w:b/>
-          <w:color w:val="000000"/>
-          <w:sz w:val="22"/>
-        </w:rPr>
-        <w:t>Проверьте активную учётную запись</w:t>
-      </w:r>
-      <w:r>
-        <w:rPr>
-          <w:rFonts w:ascii="Arial" w:hAnsi="Arial" w:eastAsia="Arial"/>
-          <w:color w:val="292727"/>
-          <w:sz w:val="21"/>
-        </w:rPr>
-        <w:t>. Логин и роль показаны в правом верхнем углу кабинета.</w:t>
-      </w:r>
-    </w:p>
-    <w:p>
-      <w:pPr>
-        <w:pStyle w:val="ListBullet"/>
-        <w:spacing w:after="80"/>
-        <w:ind w:left="317" w:hanging="202"/>
-      </w:pPr>
-      <w:r>
-        <w:rPr>
-          <w:rFonts w:ascii="Arial" w:hAnsi="Arial" w:eastAsia="Arial"/>
-          <w:color w:val="292727"/>
-          <w:sz w:val="21"/>
-        </w:rPr>
-        <w:t>Кнопка с символом темы переключает светлое и тёмное оформление только в вашем кабинете.</w:t>
-      </w:r>
-    </w:p>
-    <w:p>
-      <w:pPr>
-        <w:pStyle w:val="ListBullet"/>
-        <w:spacing w:after="80"/>
-        <w:ind w:left="317" w:hanging="202"/>
-      </w:pPr>
-      <w:r>
-        <w:rPr>
-          <w:rFonts w:ascii="Arial" w:hAnsi="Arial" w:eastAsia="Arial"/>
-          <w:color w:val="292727"/>
-          <w:sz w:val="21"/>
-        </w:rPr>
-        <w:t>Кнопка «Выйти» завершает работу с кабинетом. Используйте её, если за компьютером будет работать другой сотрудник.</w:t>
-      </w:r>
-    </w:p>
-    <w:p>
-      <w:pPr>
-        <w:spacing w:before="120" w:after="160"/>
-        <w:ind w:left="259"/>
-      </w:pPr>
-      <w:r>
-        <w:rPr>
-          <w:rFonts w:ascii="Arial" w:hAnsi="Arial" w:eastAsia="Arial"/>
-          <w:b/>
-          <w:color w:val="FF4B18"/>
-          <w:sz w:val="21"/>
-        </w:rPr>
-        <w:t xml:space="preserve">Если вход не выполнен. </w:t>
-      </w:r>
-      <w:r>
-        <w:rPr>
-          <w:rFonts w:ascii="Arial" w:hAnsi="Arial" w:eastAsia="Arial"/>
-          <w:color w:val="292727"/>
-          <w:sz w:val="21"/>
-        </w:rPr>
-        <w:t>Проверьте логин и пароль. Если учётная запись отключена или пароль неизвестен, обратитесь к администратору.</w:t>
-      </w:r>
-    </w:p>
-    <w:p>
-      <w:pPr>
-        <w:pStyle w:val="Heading1"/>
-      </w:pPr>
-      <w:r>
-        <w:t>Инструкция для логиста</w:t>
-      </w:r>
-    </w:p>
-    <w:p>
-      <w:pPr>
-        <w:pStyle w:val="Heading2"/>
-      </w:pPr>
-      <w:r>
-        <w:t>Экран Транспорт</w:t>
-      </w:r>
-    </w:p>
-    <w:p>
-      <w:pPr>
-        <w:spacing w:after="140"/>
-      </w:pPr>
-      <w:r>
-        <w:t>После входа открывается список транспортных средств. По умолчанию показаны активные записи, а более поздние обращения находятся выше.</w:t>
-      </w:r>
-    </w:p>
-    <w:p>
-      <w:pPr>
-        <w:pStyle w:val="ListBullet"/>
-        <w:spacing w:after="80"/>
-        <w:ind w:left="317" w:hanging="202"/>
-      </w:pPr>
-      <w:r>
-        <w:rPr>
-          <w:rFonts w:ascii="Arial" w:hAnsi="Arial" w:eastAsia="Arial"/>
-          <w:color w:val="292727"/>
-          <w:sz w:val="21"/>
-        </w:rPr>
-        <w:t>Номер автомобиля — номер, который передал водитель.</w:t>
-      </w:r>
-    </w:p>
-    <w:p>
-      <w:pPr>
-        <w:pStyle w:val="ListBullet"/>
-        <w:spacing w:after="80"/>
-        <w:ind w:left="317" w:hanging="202"/>
-      </w:pPr>
-      <w:r>
-        <w:rPr>
-          <w:rFonts w:ascii="Arial" w:hAnsi="Arial" w:eastAsia="Arial"/>
-          <w:color w:val="292727"/>
-          <w:sz w:val="21"/>
-        </w:rPr>
-        <w:t>Телефон — контакт для связи с водителем.</w:t>
-      </w:r>
-    </w:p>
-    <w:p>
-      <w:pPr>
-        <w:pStyle w:val="ListBullet"/>
-        <w:spacing w:after="80"/>
-        <w:ind w:left="317" w:hanging="202"/>
-      </w:pPr>
-      <w:r>
-        <w:rPr>
-          <w:rFonts w:ascii="Arial" w:hAnsi="Arial" w:eastAsia="Arial"/>
-          <w:color w:val="292727"/>
-          <w:sz w:val="21"/>
-        </w:rPr>
-        <w:t>Получен — дата и время поступления записи.</w:t>
-      </w:r>
-    </w:p>
-    <w:p>
-      <w:pPr>
-        <w:pStyle w:val="ListBullet"/>
-        <w:spacing w:after="80"/>
-        <w:ind w:left="317" w:hanging="202"/>
-      </w:pPr>
-      <w:r>
-        <w:rPr>
-          <w:rFonts w:ascii="Arial" w:hAnsi="Arial" w:eastAsia="Arial"/>
-          <w:color w:val="292727"/>
-          <w:sz w:val="21"/>
-        </w:rPr>
-        <w:t>Статус — активна запись или скрыта.</w:t>
-      </w:r>
-    </w:p>
-    <w:p>
-      <w:pPr>
-        <w:pStyle w:val="Heading2"/>
-      </w:pPr>
-      <w:r>
-        <w:t>Поиск и фильтрация</w:t>
-      </w:r>
-    </w:p>
-    <w:p>
-      <w:pPr>
-        <w:spacing w:after="110"/>
-        <w:ind w:left="547" w:hanging="547"/>
-      </w:pPr>
-      <w:r>
-        <w:rPr>
-          <w:rFonts w:ascii="Arial" w:hAnsi="Arial" w:eastAsia="Arial"/>
-          <w:b/>
-          <w:color w:val="FF4B18"/>
-          <w:sz w:val="22"/>
-        </w:rPr>
-        <w:t xml:space="preserve">1  </w:t>
-      </w:r>
-      <w:r>
-        <w:rPr>
-          <w:rFonts w:ascii="Arial" w:hAnsi="Arial" w:eastAsia="Arial"/>
-          <w:b/>
-          <w:color w:val="000000"/>
-          <w:sz w:val="22"/>
-        </w:rPr>
-        <w:t>Задайте условия</w:t>
-      </w:r>
-      <w:r>
-        <w:rPr>
-          <w:rFonts w:ascii="Arial" w:hAnsi="Arial" w:eastAsia="Arial"/>
-          <w:color w:val="292727"/>
-          <w:sz w:val="21"/>
-        </w:rPr>
-        <w:t>. Можно выбрать даты, ввести номер автомобиля, изменить порядок и выбрать видимость записей.</w:t>
-      </w:r>
-    </w:p>
-    <w:p>
-      <w:pPr>
-        <w:spacing w:after="110"/>
-        <w:ind w:left="547" w:hanging="547"/>
-      </w:pPr>
-      <w:r>
-        <w:rPr>
-          <w:rFonts w:ascii="Arial" w:hAnsi="Arial" w:eastAsia="Arial"/>
-          <w:b/>
-          <w:color w:val="FF4B18"/>
-          <w:sz w:val="22"/>
-        </w:rPr>
-        <w:t xml:space="preserve">2  </w:t>
-      </w:r>
-      <w:r>
-        <w:rPr>
-          <w:rFonts w:ascii="Arial" w:hAnsi="Arial" w:eastAsia="Arial"/>
-          <w:b/>
-          <w:color w:val="000000"/>
-          <w:sz w:val="22"/>
-        </w:rPr>
-        <w:t>Нажмите «Применить»</w:t>
-      </w:r>
-      <w:r>
-        <w:rPr>
-          <w:rFonts w:ascii="Arial" w:hAnsi="Arial" w:eastAsia="Arial"/>
-          <w:color w:val="292727"/>
-          <w:sz w:val="21"/>
-        </w:rPr>
-        <w:t>. Список покажет только подходящие записи.</w:t>
-      </w:r>
-    </w:p>
-    <w:p>
-      <w:pPr>
-        <w:spacing w:after="110"/>
-        <w:ind w:left="547" w:hanging="547"/>
-      </w:pPr>
-      <w:r>
-        <w:rPr>
-          <w:rFonts w:ascii="Arial" w:hAnsi="Arial" w:eastAsia="Arial"/>
-          <w:b/>
-          <w:color w:val="FF4B18"/>
-          <w:sz w:val="22"/>
-        </w:rPr>
-        <w:t xml:space="preserve">3  </w:t>
-      </w:r>
-      <w:r>
-        <w:rPr>
-          <w:rFonts w:ascii="Arial" w:hAnsi="Arial" w:eastAsia="Arial"/>
-          <w:b/>
-          <w:color w:val="000000"/>
-          <w:sz w:val="22"/>
-        </w:rPr>
-        <w:t>Верните полный список</w:t>
-      </w:r>
-      <w:r>
-        <w:rPr>
-          <w:rFonts w:ascii="Arial" w:hAnsi="Arial" w:eastAsia="Arial"/>
-          <w:color w:val="292727"/>
-          <w:sz w:val="21"/>
-        </w:rPr>
-        <w:t>. Нажмите «Сбросить», чтобы очистить выбранные условия.</w:t>
-      </w:r>
-    </w:p>
-    <w:p>
-      <w:pPr>
-        <w:spacing w:before="120" w:after="160"/>
-        <w:ind w:left="259"/>
-      </w:pPr>
-      <w:r>
-        <w:rPr>
-          <w:rFonts w:ascii="Arial" w:hAnsi="Arial" w:eastAsia="Arial"/>
-          <w:b/>
-          <w:color w:val="FF4B18"/>
-          <w:sz w:val="21"/>
-        </w:rPr>
-        <w:t xml:space="preserve">Поиск номера. </w:t>
-      </w:r>
-      <w:r>
-        <w:rPr>
-          <w:rFonts w:ascii="Arial" w:hAnsi="Arial" w:eastAsia="Arial"/>
-          <w:color w:val="292727"/>
-          <w:sz w:val="21"/>
-        </w:rPr>
-        <w:t>Можно вводить похожие русские и латинские буквы. Например, поиск распознаёт визуально совпадающие символы А и A.</w:t>
-      </w:r>
-    </w:p>
-    <w:p>
-      <w:pPr>
-        <w:pStyle w:val="Heading2"/>
-      </w:pPr>
-      <w:r>
-        <w:t>Работа со списком</w:t>
-      </w:r>
-    </w:p>
-    <w:p>
-      <w:pPr>
-        <w:spacing w:after="110"/>
-        <w:ind w:left="547" w:hanging="547"/>
-      </w:pPr>
-      <w:r>
-        <w:rPr>
-          <w:rFonts w:ascii="Arial" w:hAnsi="Arial" w:eastAsia="Arial"/>
-          <w:b/>
-          <w:color w:val="FF4B18"/>
-          <w:sz w:val="22"/>
-        </w:rPr>
-        <w:t xml:space="preserve">1  </w:t>
-      </w:r>
-      <w:r>
-        <w:rPr>
-          <w:rFonts w:ascii="Arial" w:hAnsi="Arial" w:eastAsia="Arial"/>
-          <w:b/>
-          <w:color w:val="000000"/>
-          <w:sz w:val="22"/>
-        </w:rPr>
-        <w:t>Найдите нужный автомобиль</w:t>
-      </w:r>
-      <w:r>
-        <w:rPr>
-          <w:rFonts w:ascii="Arial" w:hAnsi="Arial" w:eastAsia="Arial"/>
-          <w:color w:val="292727"/>
-          <w:sz w:val="21"/>
-        </w:rPr>
-        <w:t>. Используйте номер, дату или телефон в строке записи.</w:t>
-      </w:r>
-    </w:p>
-    <w:p>
-      <w:pPr>
-        <w:spacing w:after="110"/>
-        <w:ind w:left="547" w:hanging="547"/>
-      </w:pPr>
-      <w:r>
-        <w:rPr>
-          <w:rFonts w:ascii="Arial" w:hAnsi="Arial" w:eastAsia="Arial"/>
-          <w:b/>
-          <w:color w:val="FF4B18"/>
-          <w:sz w:val="22"/>
-        </w:rPr>
-        <w:t xml:space="preserve">2  </w:t>
-      </w:r>
-      <w:r>
-        <w:rPr>
-          <w:rFonts w:ascii="Arial" w:hAnsi="Arial" w:eastAsia="Arial"/>
-          <w:b/>
-          <w:color w:val="000000"/>
-          <w:sz w:val="22"/>
-        </w:rPr>
-        <w:t>Свяжитесь с водителем</w:t>
-      </w:r>
-      <w:r>
-        <w:rPr>
-          <w:rFonts w:ascii="Arial" w:hAnsi="Arial" w:eastAsia="Arial"/>
-          <w:color w:val="292727"/>
-          <w:sz w:val="21"/>
-        </w:rPr>
-        <w:t>. Используйте телефон, указанный в записи.</w:t>
-      </w:r>
-    </w:p>
-    <w:p>
-      <w:pPr>
-        <w:spacing w:after="110"/>
-        <w:ind w:left="547" w:hanging="547"/>
-      </w:pPr>
-      <w:r>
-        <w:rPr>
-          <w:rFonts w:ascii="Arial" w:hAnsi="Arial" w:eastAsia="Arial"/>
-          <w:b/>
-          <w:color w:val="FF4B18"/>
-          <w:sz w:val="22"/>
-        </w:rPr>
-        <w:t xml:space="preserve">3  </w:t>
-      </w:r>
-      <w:r>
-        <w:rPr>
-          <w:rFonts w:ascii="Arial" w:hAnsi="Arial" w:eastAsia="Arial"/>
-          <w:b/>
-          <w:color w:val="000000"/>
-          <w:sz w:val="22"/>
-        </w:rPr>
-        <w:t>Скройте обработанную запись</w:t>
-      </w:r>
-      <w:r>
-        <w:rPr>
-          <w:rFonts w:ascii="Arial" w:hAnsi="Arial" w:eastAsia="Arial"/>
-          <w:color w:val="292727"/>
-          <w:sz w:val="21"/>
-        </w:rPr>
-        <w:t>. Нажмите «Скрыть», когда запись больше не нужна в рабочем списке.</w:t>
-      </w:r>
-    </w:p>
-    <w:p>
-      <w:pPr>
-        <w:spacing w:after="110"/>
-        <w:ind w:left="547" w:hanging="547"/>
-      </w:pPr>
-      <w:r>
-        <w:rPr>
-          <w:rFonts w:ascii="Arial" w:hAnsi="Arial" w:eastAsia="Arial"/>
-          <w:b/>
-          <w:color w:val="FF4B18"/>
-          <w:sz w:val="22"/>
-        </w:rPr>
-        <w:t xml:space="preserve">4  </w:t>
-      </w:r>
-      <w:r>
-        <w:rPr>
-          <w:rFonts w:ascii="Arial" w:hAnsi="Arial" w:eastAsia="Arial"/>
-          <w:b/>
-          <w:color w:val="000000"/>
-          <w:sz w:val="22"/>
-        </w:rPr>
-        <w:t>Верните запись при необходимости</w:t>
-      </w:r>
-      <w:r>
-        <w:rPr>
-          <w:rFonts w:ascii="Arial" w:hAnsi="Arial" w:eastAsia="Arial"/>
-          <w:color w:val="292727"/>
-          <w:sz w:val="21"/>
-        </w:rPr>
-        <w:t>. Выберите в фильтре видимости «Скрытые» или «Все», нажмите «Применить», затем нажмите «Вернуть» у нужной записи.</w:t>
-      </w:r>
-    </w:p>
-    <w:p>
-      <w:pPr>
-        <w:pStyle w:val="Heading2"/>
-      </w:pPr>
-      <w:r>
-        <w:t>Страницы и выгрузка</w:t>
-      </w:r>
-    </w:p>
-    <w:p>
-      <w:pPr>
-        <w:pStyle w:val="ListBullet"/>
-        <w:spacing w:after="80"/>
-        <w:ind w:left="317" w:hanging="202"/>
-      </w:pPr>
-      <w:r>
-        <w:rPr>
-          <w:rFonts w:ascii="Arial" w:hAnsi="Arial" w:eastAsia="Arial"/>
-          <w:color w:val="292727"/>
-          <w:sz w:val="21"/>
-        </w:rPr>
-        <w:t>В поле «На странице» выберите 10, 25, 50 или 100 записей.</w:t>
-      </w:r>
-    </w:p>
-    <w:p>
-      <w:pPr>
-        <w:pStyle w:val="ListBullet"/>
-        <w:spacing w:after="80"/>
-        <w:ind w:left="317" w:hanging="202"/>
-      </w:pPr>
-      <w:r>
-        <w:rPr>
-          <w:rFonts w:ascii="Arial" w:hAnsi="Arial" w:eastAsia="Arial"/>
-          <w:color w:val="292727"/>
-          <w:sz w:val="21"/>
-        </w:rPr>
-        <w:t>Кнопки «Назад» и «Вперёд» переключают страницы списка.</w:t>
-      </w:r>
-    </w:p>
-    <w:p>
-      <w:pPr>
-        <w:pStyle w:val="ListBullet"/>
-        <w:spacing w:after="80"/>
-        <w:ind w:left="317" w:hanging="202"/>
-      </w:pPr>
-      <w:r>
-        <w:rPr>
-          <w:rFonts w:ascii="Arial" w:hAnsi="Arial" w:eastAsia="Arial"/>
-          <w:color w:val="292727"/>
-          <w:sz w:val="21"/>
-        </w:rPr>
-        <w:t>Кнопка «Выгрузить в Excel» сохраняет все записи, подходящие под выбранные фильтры, а не только текущую страницу.</w:t>
-      </w:r>
-    </w:p>
-    <w:p>
-      <w:pPr>
-        <w:pStyle w:val="Heading1"/>
-      </w:pPr>
-      <w:r>
-        <w:t>Инструкция для администратора</w:t>
-      </w:r>
-    </w:p>
-    <w:p>
-      <w:pPr>
-        <w:spacing w:after="160"/>
-      </w:pPr>
-      <w:r>
-        <w:t>Администратору доступны три вкладки: «Транспорт», «Пользователи» и «Настройки». Во вкладке «Транспорт» администратор работает так же, как логист.</w:t>
-      </w:r>
-    </w:p>
-    <w:p>
-      <w:pPr>
-        <w:pStyle w:val="Heading2"/>
-      </w:pPr>
-      <w:r>
-        <w:t>Экран Пользователи</w:t>
+        <w:t>После работы нажмите «Выйти» в правом верхнем углу, особенно на общем компьютере.</w:t>
       </w:r>
     </w:p>
     <w:p>
       <w:r>
-        <w:t>В таблице показаны логин, роль, состояние и дата создания каждой учётной записи. Чтобы открыть действия, нажмите на строку пользователя.</w:t>
+        <w:rPr>
+          <w:b/>
+        </w:rPr>
+        <w:t>Если вход не выполняется, обратитесь к администратору: учётная запись может быть отключена или пароль мог измениться.</w:t>
       </w:r>
     </w:p>
     <w:p>
@@ -915,401 +234,16 @@
     </w:p>
     <w:p>
       <w:pPr>
-        <w:pStyle w:val="Heading2"/>
-      </w:pPr>
-      <w:r>
-        <w:t>Создание пользователя</w:t>
-      </w:r>
-    </w:p>
-    <w:p>
-      <w:pPr>
-        <w:spacing w:after="110"/>
-        <w:ind w:left="547" w:hanging="547"/>
+        <w:spacing w:after="80"/>
       </w:pPr>
       <w:r>
         <w:rPr>
-          <w:rFonts w:ascii="Arial" w:hAnsi="Arial" w:eastAsia="Arial"/>
+          <w:rFonts w:ascii="Arial" w:hAnsi="Arial"/>
           <w:b/>
-          <w:color w:val="FF4B18"/>
-          <w:sz w:val="22"/>
+          <w:color w:val="FF4B1F"/>
+          <w:sz w:val="18"/>
         </w:rPr>
-        <w:t xml:space="preserve">1  </w:t>
-      </w:r>
-      <w:r>
-        <w:rPr>
-          <w:rFonts w:ascii="Arial" w:hAnsi="Arial" w:eastAsia="Arial"/>
-          <w:b/>
-          <w:color w:val="000000"/>
-          <w:sz w:val="22"/>
-        </w:rPr>
-        <w:t>Откройте вкладку «Пользователи»</w:t>
-      </w:r>
-      <w:r>
-        <w:rPr>
-          <w:rFonts w:ascii="Arial" w:hAnsi="Arial" w:eastAsia="Arial"/>
-          <w:color w:val="292727"/>
-          <w:sz w:val="21"/>
-        </w:rPr>
-        <w:t>. Форма создания находится над списком пользователей.</w:t>
-      </w:r>
-    </w:p>
-    <w:p>
-      <w:pPr>
-        <w:spacing w:after="110"/>
-        <w:ind w:left="547" w:hanging="547"/>
-      </w:pPr>
-      <w:r>
-        <w:rPr>
-          <w:rFonts w:ascii="Arial" w:hAnsi="Arial" w:eastAsia="Arial"/>
-          <w:b/>
-          <w:color w:val="FF4B18"/>
-          <w:sz w:val="22"/>
-        </w:rPr>
-        <w:t xml:space="preserve">2  </w:t>
-      </w:r>
-      <w:r>
-        <w:rPr>
-          <w:rFonts w:ascii="Arial" w:hAnsi="Arial" w:eastAsia="Arial"/>
-          <w:b/>
-          <w:color w:val="000000"/>
-          <w:sz w:val="22"/>
-        </w:rPr>
-        <w:t>Введите уникальный логин</w:t>
-      </w:r>
-      <w:r>
-        <w:rPr>
-          <w:rFonts w:ascii="Arial" w:hAnsi="Arial" w:eastAsia="Arial"/>
-          <w:color w:val="292727"/>
-          <w:sz w:val="21"/>
-        </w:rPr>
-        <w:t>. Логин должен содержать от 3 до 64 символов.</w:t>
-      </w:r>
-    </w:p>
-    <w:p>
-      <w:pPr>
-        <w:spacing w:after="110"/>
-        <w:ind w:left="547" w:hanging="547"/>
-      </w:pPr>
-      <w:r>
-        <w:rPr>
-          <w:rFonts w:ascii="Arial" w:hAnsi="Arial" w:eastAsia="Arial"/>
-          <w:b/>
-          <w:color w:val="FF4B18"/>
-          <w:sz w:val="22"/>
-        </w:rPr>
-        <w:t xml:space="preserve">3  </w:t>
-      </w:r>
-      <w:r>
-        <w:rPr>
-          <w:rFonts w:ascii="Arial" w:hAnsi="Arial" w:eastAsia="Arial"/>
-          <w:b/>
-          <w:color w:val="000000"/>
-          <w:sz w:val="22"/>
-        </w:rPr>
-        <w:t>Задайте пароль</w:t>
-      </w:r>
-      <w:r>
-        <w:rPr>
-          <w:rFonts w:ascii="Arial" w:hAnsi="Arial" w:eastAsia="Arial"/>
-          <w:color w:val="292727"/>
-          <w:sz w:val="21"/>
-        </w:rPr>
-        <w:t>. Используйте не менее 8 символов: букву, цифру и специальный символ. Кнопка «Показать» позволяет проверить введённый пароль.</w:t>
-      </w:r>
-    </w:p>
-    <w:p>
-      <w:pPr>
-        <w:spacing w:after="110"/>
-        <w:ind w:left="547" w:hanging="547"/>
-      </w:pPr>
-      <w:r>
-        <w:rPr>
-          <w:rFonts w:ascii="Arial" w:hAnsi="Arial" w:eastAsia="Arial"/>
-          <w:b/>
-          <w:color w:val="FF4B18"/>
-          <w:sz w:val="22"/>
-        </w:rPr>
-        <w:t xml:space="preserve">4  </w:t>
-      </w:r>
-      <w:r>
-        <w:rPr>
-          <w:rFonts w:ascii="Arial" w:hAnsi="Arial" w:eastAsia="Arial"/>
-          <w:b/>
-          <w:color w:val="000000"/>
-          <w:sz w:val="22"/>
-        </w:rPr>
-        <w:t>Выберите роль</w:t>
-      </w:r>
-      <w:r>
-        <w:rPr>
-          <w:rFonts w:ascii="Arial" w:hAnsi="Arial" w:eastAsia="Arial"/>
-          <w:color w:val="292727"/>
-          <w:sz w:val="21"/>
-        </w:rPr>
-        <w:t>. Роль «Логист» даёт доступ только к транспорту. Роль «Администратор» дополнительно открывает пользователей и настройки.</w:t>
-      </w:r>
-    </w:p>
-    <w:p>
-      <w:pPr>
-        <w:spacing w:after="110"/>
-        <w:ind w:left="547" w:hanging="547"/>
-      </w:pPr>
-      <w:r>
-        <w:rPr>
-          <w:rFonts w:ascii="Arial" w:hAnsi="Arial" w:eastAsia="Arial"/>
-          <w:b/>
-          <w:color w:val="FF4B18"/>
-          <w:sz w:val="22"/>
-        </w:rPr>
-        <w:t xml:space="preserve">5  </w:t>
-      </w:r>
-      <w:r>
-        <w:rPr>
-          <w:rFonts w:ascii="Arial" w:hAnsi="Arial" w:eastAsia="Arial"/>
-          <w:b/>
-          <w:color w:val="000000"/>
-          <w:sz w:val="22"/>
-        </w:rPr>
-        <w:t>Нажмите «Создать»</w:t>
-      </w:r>
-      <w:r>
-        <w:rPr>
-          <w:rFonts w:ascii="Arial" w:hAnsi="Arial" w:eastAsia="Arial"/>
-          <w:color w:val="292727"/>
-          <w:sz w:val="21"/>
-        </w:rPr>
-        <w:t>. Передайте сотруднику его логин и временный пароль безопасным способом.</w:t>
-      </w:r>
-    </w:p>
-    <w:p>
-      <w:pPr>
-        <w:pStyle w:val="Heading2"/>
-      </w:pPr>
-      <w:r>
-        <w:t>Пароль пользователя</w:t>
-      </w:r>
-    </w:p>
-    <w:p>
-      <w:pPr>
-        <w:spacing w:after="110"/>
-        <w:ind w:left="547" w:hanging="547"/>
-      </w:pPr>
-      <w:r>
-        <w:rPr>
-          <w:rFonts w:ascii="Arial" w:hAnsi="Arial" w:eastAsia="Arial"/>
-          <w:b/>
-          <w:color w:val="FF4B18"/>
-          <w:sz w:val="22"/>
-        </w:rPr>
-        <w:t xml:space="preserve">1  </w:t>
-      </w:r>
-      <w:r>
-        <w:rPr>
-          <w:rFonts w:ascii="Arial" w:hAnsi="Arial" w:eastAsia="Arial"/>
-          <w:b/>
-          <w:color w:val="000000"/>
-          <w:sz w:val="22"/>
-        </w:rPr>
-        <w:t>Нажмите на строку пользователя</w:t>
-      </w:r>
-      <w:r>
-        <w:rPr>
-          <w:rFonts w:ascii="Arial" w:hAnsi="Arial" w:eastAsia="Arial"/>
-          <w:color w:val="292727"/>
-          <w:sz w:val="21"/>
-        </w:rPr>
-        <w:t>. Откроется окно доступных действий.</w:t>
-      </w:r>
-    </w:p>
-    <w:p>
-      <w:pPr>
-        <w:spacing w:after="110"/>
-        <w:ind w:left="547" w:hanging="547"/>
-      </w:pPr>
-      <w:r>
-        <w:rPr>
-          <w:rFonts w:ascii="Arial" w:hAnsi="Arial" w:eastAsia="Arial"/>
-          <w:b/>
-          <w:color w:val="FF4B18"/>
-          <w:sz w:val="22"/>
-        </w:rPr>
-        <w:t xml:space="preserve">2  </w:t>
-      </w:r>
-      <w:r>
-        <w:rPr>
-          <w:rFonts w:ascii="Arial" w:hAnsi="Arial" w:eastAsia="Arial"/>
-          <w:b/>
-          <w:color w:val="000000"/>
-          <w:sz w:val="22"/>
-        </w:rPr>
-        <w:t>Выберите «Изменить пароль»</w:t>
-      </w:r>
-      <w:r>
-        <w:rPr>
-          <w:rFonts w:ascii="Arial" w:hAnsi="Arial" w:eastAsia="Arial"/>
-          <w:color w:val="292727"/>
-          <w:sz w:val="21"/>
-        </w:rPr>
-        <w:t>. Введите новый пароль и нажмите «Сохранить пароль».</w:t>
-      </w:r>
-    </w:p>
-    <w:p>
-      <w:pPr>
-        <w:spacing w:before="120" w:after="160"/>
-        <w:ind w:left="259"/>
-      </w:pPr>
-      <w:r>
-        <w:rPr>
-          <w:rFonts w:ascii="Arial" w:hAnsi="Arial" w:eastAsia="Arial"/>
-          <w:b/>
-          <w:color w:val="FF4B18"/>
-          <w:sz w:val="21"/>
-        </w:rPr>
-        <w:t xml:space="preserve">После смены пароля. </w:t>
-      </w:r>
-      <w:r>
-        <w:rPr>
-          <w:rFonts w:ascii="Arial" w:hAnsi="Arial" w:eastAsia="Arial"/>
-          <w:color w:val="292727"/>
-          <w:sz w:val="21"/>
-        </w:rPr>
-        <w:t>Активный вход пользователя завершается. Для продолжения работы ему потребуется войти с новым паролем.</w:t>
-      </w:r>
-    </w:p>
-    <w:p>
-      <w:pPr>
-        <w:pStyle w:val="Heading2"/>
-      </w:pPr>
-      <w:r>
-        <w:t>Отключение и восстановление</w:t>
-      </w:r>
-    </w:p>
-    <w:p>
-      <w:pPr>
-        <w:pStyle w:val="ListBullet"/>
-        <w:spacing w:after="80"/>
-        <w:ind w:left="317" w:hanging="202"/>
-      </w:pPr>
-      <w:r>
-        <w:rPr>
-          <w:rFonts w:ascii="Arial" w:hAnsi="Arial" w:eastAsia="Arial"/>
-          <w:color w:val="292727"/>
-          <w:sz w:val="21"/>
-        </w:rPr>
-        <w:t>Чтобы закрыть доступ, нажмите на строку пользователя и выберите «Отключить».</w:t>
-      </w:r>
-    </w:p>
-    <w:p>
-      <w:pPr>
-        <w:pStyle w:val="ListBullet"/>
-        <w:spacing w:after="80"/>
-        <w:ind w:left="317" w:hanging="202"/>
-      </w:pPr>
-      <w:r>
-        <w:rPr>
-          <w:rFonts w:ascii="Arial" w:hAnsi="Arial" w:eastAsia="Arial"/>
-          <w:color w:val="292727"/>
-          <w:sz w:val="21"/>
-        </w:rPr>
-        <w:t>Отключённая учётная запись остаётся в списке, но пользователь не может войти и теряет текущий доступ.</w:t>
-      </w:r>
-    </w:p>
-    <w:p>
-      <w:pPr>
-        <w:pStyle w:val="ListBullet"/>
-        <w:spacing w:after="80"/>
-        <w:ind w:left="317" w:hanging="202"/>
-      </w:pPr>
-      <w:r>
-        <w:rPr>
-          <w:rFonts w:ascii="Arial" w:hAnsi="Arial" w:eastAsia="Arial"/>
-          <w:color w:val="292727"/>
-          <w:sz w:val="21"/>
-        </w:rPr>
-        <w:t>Чтобы вернуть доступ, снова откройте действия пользователя и нажмите «Включить».</w:t>
-      </w:r>
-    </w:p>
-    <w:p>
-      <w:pPr>
-        <w:pStyle w:val="ListBullet"/>
-        <w:spacing w:after="80"/>
-        <w:ind w:left="317" w:hanging="202"/>
-      </w:pPr>
-      <w:r>
-        <w:rPr>
-          <w:rFonts w:ascii="Arial" w:hAnsi="Arial" w:eastAsia="Arial"/>
-          <w:color w:val="292727"/>
-          <w:sz w:val="21"/>
-        </w:rPr>
-        <w:t>Текущую учётную запись администратора отключить нельзя. Сервис также не позволит отключить последнего активного администратора.</w:t>
-      </w:r>
-    </w:p>
-    <w:p>
-      <w:pPr>
-        <w:pStyle w:val="Heading2"/>
-      </w:pPr>
-      <w:r>
-        <w:t>Экран Настройки</w:t>
-      </w:r>
-    </w:p>
-    <w:p>
-      <w:pPr>
-        <w:pStyle w:val="ListBullet"/>
-        <w:spacing w:after="80"/>
-        <w:ind w:left="317" w:hanging="202"/>
-      </w:pPr>
-      <w:r>
-        <w:rPr>
-          <w:rFonts w:ascii="Arial" w:hAnsi="Arial" w:eastAsia="Arial"/>
-          <w:color w:val="292727"/>
-          <w:sz w:val="21"/>
-        </w:rPr>
-        <w:t>В блоке «Тема водительского киоска» выберите светлое или тёмное оформление. Выбор применяется к водительской странице.</w:t>
-      </w:r>
-    </w:p>
-    <w:p>
-      <w:pPr>
-        <w:pStyle w:val="ListBullet"/>
-        <w:spacing w:after="80"/>
-        <w:ind w:left="317" w:hanging="202"/>
-      </w:pPr>
-      <w:r>
-        <w:rPr>
-          <w:rFonts w:ascii="Arial" w:hAnsi="Arial" w:eastAsia="Arial"/>
-          <w:color w:val="292727"/>
-          <w:sz w:val="21"/>
-        </w:rPr>
-        <w:t>В блоке «Тексты водительского киоска» выберите язык, измените заголовок и текст под клавиатурой, затем нажмите «Сохранить тексты».</w:t>
-      </w:r>
-    </w:p>
-    <w:p>
-      <w:pPr>
-        <w:pStyle w:val="ListBullet"/>
-        <w:spacing w:after="80"/>
-        <w:ind w:left="317" w:hanging="202"/>
-      </w:pPr>
-      <w:r>
-        <w:rPr>
-          <w:rFonts w:ascii="Arial" w:hAnsi="Arial" w:eastAsia="Arial"/>
-          <w:color w:val="292727"/>
-          <w:sz w:val="21"/>
-        </w:rPr>
-        <w:t>Текст под клавиатурой может занимать не более двух строк и содержать до 300 символов.</w:t>
-      </w:r>
-    </w:p>
-    <w:p>
-      <w:pPr>
-        <w:pStyle w:val="ListBullet"/>
-        <w:spacing w:after="80"/>
-        <w:ind w:left="317" w:hanging="202"/>
-      </w:pPr>
-      <w:r>
-        <w:rPr>
-          <w:rFonts w:ascii="Arial" w:hAnsi="Arial" w:eastAsia="Arial"/>
-          <w:color w:val="292727"/>
-          <w:sz w:val="21"/>
-        </w:rPr>
-        <w:t>Настраивайте языки по одному. Изменение одного языка не меняет тексты остальных языков.</w:t>
+        <w:t>ИНСТРУКЦИЯ ДЛЯ ЛОГИСТА</w:t>
       </w:r>
     </w:p>
     <w:p>
@@ -1317,7 +251,279 @@
         <w:pStyle w:val="Heading1"/>
       </w:pPr>
       <w:r>
-        <w:t>Если что-то не получается</w:t>
+        <w:t>Экран «Транспорт»</w:t>
+      </w:r>
+    </w:p>
+    <w:p>
+      <w:pPr>
+        <w:spacing w:after="160"/>
+      </w:pPr>
+      <w:r>
+        <w:rPr>
+          <w:color w:val="696969"/>
+        </w:rPr>
+        <w:t>Здесь собраны обращения водителей. По умолчанию новые записи находятся сверху, а в списке показаны активные записи.</w:t>
+      </w:r>
+    </w:p>
+    <w:p>
+      <w:pPr>
+        <w:spacing w:after="180"/>
+        <w:pBdr>
+          <w:bottom w:val="single" w:sz="20" w:color="FF4B1F"/>
+        </w:pBdr>
+      </w:pPr>
+    </w:p>
+    <w:p>
+      <w:pPr>
+        <w:jc w:val="center"/>
+      </w:pPr>
+      <w:r>
+        <w:drawing>
+          <wp:inline xmlns:a="http://schemas.openxmlformats.org/drawingml/2006/main" xmlns:pic="http://schemas.openxmlformats.org/drawingml/2006/picture">
+            <wp:extent cx="6120000" cy="4250000"/>
+            <wp:docPr id="1" name="Picture 1" descr="Экран логиста «Транспорт» с шестью стрелками к основным элементам управления." title="Экран логиста «Транспорт» с шестью стрелками к основным элементам управления."/>
+            <wp:cNvGraphicFramePr>
+              <a:graphicFrameLocks noChangeAspect="1"/>
+            </wp:cNvGraphicFramePr>
+            <a:graphic>
+              <a:graphicData uri="http://schemas.openxmlformats.org/drawingml/2006/picture">
+                <pic:pic>
+                  <pic:nvPicPr>
+                    <pic:cNvPr id="0" name="logist_annotated.png"/>
+                    <pic:cNvPicPr/>
+                  </pic:nvPicPr>
+                  <pic:blipFill>
+                    <a:blip r:embed="rId9"/>
+                    <a:stretch>
+                      <a:fillRect/>
+                    </a:stretch>
+                  </pic:blipFill>
+                  <pic:spPr>
+                    <a:xfrm>
+                      <a:off x="0" y="0"/>
+                      <a:ext cx="6120000" cy="4250000"/>
+                    </a:xfrm>
+                    <a:prstGeom prst="rect"/>
+                  </pic:spPr>
+                </pic:pic>
+              </a:graphicData>
+            </a:graphic>
+          </wp:inline>
+        </w:drawing>
+      </w:r>
+    </w:p>
+    <w:tbl>
+      <w:tblPr>
+        <w:tblW w:type="auto" w:w="0"/>
+        <w:jc w:val="center"/>
+        <w:tblLayout w:type="fixed"/>
+        <w:tblLook w:firstColumn="1" w:firstRow="1" w:lastColumn="0" w:lastRow="0" w:noHBand="0" w:noVBand="1" w:val="04A0"/>
+      </w:tblPr>
+      <w:tblGrid>
+        <w:gridCol w:w="7569"/>
+        <w:gridCol w:w="7569"/>
+      </w:tblGrid>
+      <w:tr>
+        <w:trPr>
+          <w:tblHeader w:val="true"/>
+        </w:trPr>
+        <w:tc>
+          <w:tcPr>
+            <w:tcW w:type="dxa" w:w="7087"/>
+            <w:vAlign w:val="center"/>
+            <w:shd w:fill="F5F3F1"/>
+          </w:tcPr>
+          <w:p>
+            <w:pPr>
+              <w:spacing w:after="20"/>
+            </w:pPr>
+            <w:r>
+              <w:rPr>
+                <w:b/>
+                <w:color w:val="FF4B1F"/>
+              </w:rPr>
+              <w:t xml:space="preserve">1  </w:t>
+            </w:r>
+            <w:r>
+              <w:rPr>
+                <w:sz w:val="19"/>
+              </w:rPr>
+              <w:t>Тема кабинета, текущая учётная запись и выход.</w:t>
+            </w:r>
+          </w:p>
+        </w:tc>
+        <w:tc>
+          <w:tcPr>
+            <w:tcW w:type="dxa" w:w="7087"/>
+            <w:vAlign w:val="center"/>
+            <w:shd w:fill="F5F3F1"/>
+          </w:tcPr>
+          <w:p>
+            <w:pPr>
+              <w:spacing w:after="20"/>
+            </w:pPr>
+            <w:r>
+              <w:rPr>
+                <w:b/>
+                <w:color w:val="FF4B1F"/>
+              </w:rPr>
+              <w:t xml:space="preserve">4  </w:t>
+            </w:r>
+            <w:r>
+              <w:rPr>
+                <w:sz w:val="19"/>
+              </w:rPr>
+              <w:t>Рабочий список: номер автомобиля, телефон, время и статус.</w:t>
+            </w:r>
+          </w:p>
+        </w:tc>
+      </w:tr>
+      <w:tr>
+        <w:tc>
+          <w:tcPr>
+            <w:tcW w:type="dxa" w:w="7087"/>
+            <w:vAlign w:val="center"/>
+            <w:shd w:fill="F5F3F1"/>
+          </w:tcPr>
+          <w:p>
+            <w:pPr>
+              <w:spacing w:after="20"/>
+            </w:pPr>
+            <w:r>
+              <w:rPr>
+                <w:b/>
+                <w:color w:val="FF4B1F"/>
+              </w:rPr>
+              <w:t xml:space="preserve">2  </w:t>
+            </w:r>
+            <w:r>
+              <w:rPr>
+                <w:sz w:val="19"/>
+              </w:rPr>
+              <w:t>Выгрузка списка, соответствующего выбранным фильтрам.</w:t>
+            </w:r>
+          </w:p>
+        </w:tc>
+        <w:tc>
+          <w:tcPr>
+            <w:tcW w:type="dxa" w:w="7087"/>
+            <w:vAlign w:val="center"/>
+            <w:shd w:fill="F5F3F1"/>
+          </w:tcPr>
+          <w:p>
+            <w:pPr>
+              <w:spacing w:after="20"/>
+            </w:pPr>
+            <w:r>
+              <w:rPr>
+                <w:b/>
+                <w:color w:val="FF4B1F"/>
+              </w:rPr>
+              <w:t xml:space="preserve">5  </w:t>
+            </w:r>
+            <w:r>
+              <w:rPr>
+                <w:sz w:val="19"/>
+              </w:rPr>
+              <w:t>«Скрыть» убирает обработанную запись из активного списка.</w:t>
+            </w:r>
+          </w:p>
+        </w:tc>
+      </w:tr>
+      <w:tr>
+        <w:tc>
+          <w:tcPr>
+            <w:tcW w:type="dxa" w:w="7087"/>
+            <w:vAlign w:val="center"/>
+            <w:shd w:fill="F5F3F1"/>
+          </w:tcPr>
+          <w:p>
+            <w:pPr>
+              <w:spacing w:after="20"/>
+            </w:pPr>
+            <w:r>
+              <w:rPr>
+                <w:b/>
+                <w:color w:val="FF4B1F"/>
+              </w:rPr>
+              <w:t xml:space="preserve">3  </w:t>
+            </w:r>
+            <w:r>
+              <w:rPr>
+                <w:sz w:val="19"/>
+              </w:rPr>
+              <w:t>Фильтры по датам, номеру, порядку и видимости.</w:t>
+            </w:r>
+          </w:p>
+        </w:tc>
+        <w:tc>
+          <w:tcPr>
+            <w:tcW w:type="dxa" w:w="7087"/>
+            <w:vAlign w:val="center"/>
+            <w:shd w:fill="F5F3F1"/>
+          </w:tcPr>
+          <w:p>
+            <w:pPr>
+              <w:spacing w:after="20"/>
+            </w:pPr>
+            <w:r>
+              <w:rPr>
+                <w:b/>
+                <w:color w:val="FF4B1F"/>
+              </w:rPr>
+              <w:t xml:space="preserve">6  </w:t>
+            </w:r>
+            <w:r>
+              <w:rPr>
+                <w:sz w:val="19"/>
+              </w:rPr>
+              <w:t>Выбор количества строк на странице.</w:t>
+            </w:r>
+          </w:p>
+        </w:tc>
+      </w:tr>
+    </w:tbl>
+    <w:p>
+      <w:r>
+        <w:br w:type="page"/>
+      </w:r>
+    </w:p>
+    <w:p>
+      <w:pPr>
+        <w:spacing w:after="80"/>
+      </w:pPr>
+      <w:r>
+        <w:rPr>
+          <w:rFonts w:ascii="Arial" w:hAnsi="Arial"/>
+          <w:b/>
+          <w:color w:val="FF4B1F"/>
+          <w:sz w:val="18"/>
+        </w:rPr>
+        <w:t>ИНСТРУКЦИЯ ДЛЯ ЛОГИСТА</w:t>
+      </w:r>
+    </w:p>
+    <w:p>
+      <w:pPr>
+        <w:pStyle w:val="Heading1"/>
+      </w:pPr>
+      <w:r>
+        <w:t>Основные действия</w:t>
+      </w:r>
+    </w:p>
+    <w:p>
+      <w:pPr>
+        <w:spacing w:after="180"/>
+        <w:pBdr>
+          <w:bottom w:val="single" w:sz="20" w:color="FF4B1F"/>
+        </w:pBdr>
+      </w:pPr>
+    </w:p>
+    <w:p>
+      <w:pPr>
+        <w:pStyle w:val="Heading2"/>
+      </w:pPr>
+      <w:r>
+        <w:t>Найти нужный автомобиль</w:t>
       </w:r>
     </w:p>
     <w:p>
@@ -1326,20 +532,13 @@
       </w:pPr>
       <w:r>
         <w:rPr>
-          <w:rFonts w:ascii="Arial" w:hAnsi="Arial" w:eastAsia="Arial"/>
           <w:b/>
-          <w:color w:val="000000"/>
-          <w:sz w:val="21"/>
+          <w:color w:val="FF4B1F"/>
         </w:rPr>
-        <w:t xml:space="preserve">Запись не найдена. </w:t>
+        <w:t xml:space="preserve">1.  </w:t>
       </w:r>
       <w:r>
-        <w:rPr>
-          <w:rFonts w:ascii="Arial" w:hAnsi="Arial" w:eastAsia="Arial"/>
-          <w:color w:val="292727"/>
-          <w:sz w:val="21"/>
-        </w:rPr>
-        <w:t>Сбросьте фильтры и проверьте варианты «Активные», «Скрытые» и «Все».</w:t>
+        <w:t>Введите номер в поле «Поиск номера». Допускаются похожие русские и латинские символы: поиск распознаёт визуально совпадающие буквы.</w:t>
       </w:r>
     </w:p>
     <w:p>
@@ -1348,20 +547,13 @@
       </w:pPr>
       <w:r>
         <w:rPr>
-          <w:rFonts w:ascii="Arial" w:hAnsi="Arial" w:eastAsia="Arial"/>
           <w:b/>
-          <w:color w:val="000000"/>
-          <w:sz w:val="21"/>
+          <w:color w:val="FF4B1F"/>
         </w:rPr>
-        <w:t xml:space="preserve">Пользователь не может войти. </w:t>
+        <w:t xml:space="preserve">2.  </w:t>
       </w:r>
       <w:r>
-        <w:rPr>
-          <w:rFonts w:ascii="Arial" w:hAnsi="Arial" w:eastAsia="Arial"/>
-          <w:color w:val="292727"/>
-          <w:sz w:val="21"/>
-        </w:rPr>
-        <w:t>Проверьте его состояние во вкладке «Пользователи». При необходимости включите учётную запись или задайте новый пароль.</w:t>
+        <w:t>При необходимости выберите период, порядок записей и их видимость.</w:t>
       </w:r>
     </w:p>
     <w:p>
@@ -1370,20 +562,21 @@
       </w:pPr>
       <w:r>
         <w:rPr>
-          <w:rFonts w:ascii="Arial" w:hAnsi="Arial" w:eastAsia="Arial"/>
           <w:b/>
-          <w:color w:val="000000"/>
-          <w:sz w:val="21"/>
+          <w:color w:val="FF4B1F"/>
         </w:rPr>
-        <w:t xml:space="preserve">Пароль не сохраняется. </w:t>
+        <w:t xml:space="preserve">3.  </w:t>
       </w:r>
       <w:r>
-        <w:rPr>
-          <w:rFonts w:ascii="Arial" w:hAnsi="Arial" w:eastAsia="Arial"/>
-          <w:color w:val="292727"/>
-          <w:sz w:val="21"/>
-        </w:rPr>
-        <w:t>Проверьте, что в нём не менее 8 символов и есть буква, цифра и специальный символ.</w:t>
+        <w:t>Нажмите «Применить». Чтобы снова увидеть полный список, нажмите «Сбросить».</w:t>
+      </w:r>
+    </w:p>
+    <w:p>
+      <w:pPr>
+        <w:pStyle w:val="Heading2"/>
+      </w:pPr>
+      <w:r>
+        <w:t>Обработать обращение</w:t>
       </w:r>
     </w:p>
     <w:p>
@@ -1392,26 +585,827 @@
       </w:pPr>
       <w:r>
         <w:rPr>
-          <w:rFonts w:ascii="Arial" w:hAnsi="Arial" w:eastAsia="Arial"/>
           <w:b/>
-          <w:color w:val="000000"/>
+          <w:color w:val="FF4B1F"/>
+        </w:rPr>
+        <w:t xml:space="preserve">1.  </w:t>
+      </w:r>
+      <w:r>
+        <w:t>Найдите автомобиль и свяжитесь с водителем по телефону из строки.</w:t>
+      </w:r>
+    </w:p>
+    <w:p>
+      <w:pPr>
+        <w:spacing w:after="100"/>
+      </w:pPr>
+      <w:r>
+        <w:rPr>
+          <w:b/>
+          <w:color w:val="FF4B1F"/>
+        </w:rPr>
+        <w:t xml:space="preserve">2.  </w:t>
+      </w:r>
+      <w:r>
+        <w:t>После завершения работы нажмите «Скрыть». Запись исчезнет из активного списка, но сохранится в системе.</w:t>
+      </w:r>
+    </w:p>
+    <w:p>
+      <w:pPr>
+        <w:spacing w:after="100"/>
+      </w:pPr>
+      <w:r>
+        <w:rPr>
+          <w:b/>
+          <w:color w:val="FF4B1F"/>
+        </w:rPr>
+        <w:t xml:space="preserve">3.  </w:t>
+      </w:r>
+      <w:r>
+        <w:t>Чтобы вернуть запись, выберите «Скрытые» или «Все», примените фильтр и нажмите «Вернуть».</w:t>
+      </w:r>
+    </w:p>
+    <w:p>
+      <w:pPr>
+        <w:pStyle w:val="Heading2"/>
+      </w:pPr>
+      <w:r>
+        <w:t>Страницы и Excel</w:t>
+      </w:r>
+    </w:p>
+    <w:p>
+      <w:pPr>
+        <w:pStyle w:val="ListBullet"/>
+        <w:spacing w:after="80"/>
+      </w:pPr>
+      <w:r>
+        <w:rPr>
           <w:sz w:val="21"/>
         </w:rPr>
-        <w:t xml:space="preserve">Кабинет вернул на страницу входа. </w:t>
+        <w:t>В поле «На странице» выберите удобное количество строк; кнопки внизу списка переключают страницы.</w:t>
+      </w:r>
+    </w:p>
+    <w:p>
+      <w:pPr>
+        <w:pStyle w:val="ListBullet"/>
+        <w:spacing w:after="80"/>
+      </w:pPr>
+      <w:r>
+        <w:rPr>
+          <w:sz w:val="21"/>
+        </w:rPr>
+        <w:t>«Выгрузить в Excel» выгружает весь список по текущим фильтрам, а не только открытую страницу.</w:t>
+      </w:r>
+    </w:p>
+    <w:p>
+      <w:r>
+        <w:br w:type="page"/>
+      </w:r>
+    </w:p>
+    <w:p>
+      <w:pPr>
+        <w:spacing w:after="80"/>
+      </w:pPr>
+      <w:r>
+        <w:rPr>
+          <w:rFonts w:ascii="Arial" w:hAnsi="Arial"/>
+          <w:b/>
+          <w:color w:val="FF4B1F"/>
+          <w:sz w:val="18"/>
+        </w:rPr>
+        <w:t>ИНСТРУКЦИЯ ДЛЯ АДМИНИСТРАТОРА</w:t>
+      </w:r>
+    </w:p>
+    <w:p>
+      <w:pPr>
+        <w:pStyle w:val="Heading1"/>
+      </w:pPr>
+      <w:r>
+        <w:t>Экран «Пользователи»</w:t>
+      </w:r>
+    </w:p>
+    <w:p>
+      <w:pPr>
+        <w:spacing w:after="160"/>
+      </w:pPr>
+      <w:r>
+        <w:rPr>
+          <w:color w:val="696969"/>
+        </w:rPr>
+        <w:t>Администратор работает с транспортом так же, как логист, и дополнительно управляет учётными записями и настройками киоска.</w:t>
+      </w:r>
+    </w:p>
+    <w:p>
+      <w:pPr>
+        <w:spacing w:after="180"/>
+        <w:pBdr>
+          <w:bottom w:val="single" w:sz="20" w:color="FF4B1F"/>
+        </w:pBdr>
+      </w:pPr>
+    </w:p>
+    <w:p>
+      <w:pPr>
+        <w:jc w:val="center"/>
+      </w:pPr>
+      <w:r>
+        <w:drawing>
+          <wp:inline xmlns:a="http://schemas.openxmlformats.org/drawingml/2006/main" xmlns:pic="http://schemas.openxmlformats.org/drawingml/2006/picture">
+            <wp:extent cx="6120000" cy="4250000"/>
+            <wp:docPr id="2" name="Picture 2" descr="Экран администратора «Пользователи» с шестью стрелками к форме и списку." title="Экран администратора «Пользователи» с шестью стрелками к форме и списку."/>
+            <wp:cNvGraphicFramePr>
+              <a:graphicFrameLocks noChangeAspect="1"/>
+            </wp:cNvGraphicFramePr>
+            <a:graphic>
+              <a:graphicData uri="http://schemas.openxmlformats.org/drawingml/2006/picture">
+                <pic:pic>
+                  <pic:nvPicPr>
+                    <pic:cNvPr id="0" name="admin_users_annotated.png"/>
+                    <pic:cNvPicPr/>
+                  </pic:nvPicPr>
+                  <pic:blipFill>
+                    <a:blip r:embed="rId10"/>
+                    <a:stretch>
+                      <a:fillRect/>
+                    </a:stretch>
+                  </pic:blipFill>
+                  <pic:spPr>
+                    <a:xfrm>
+                      <a:off x="0" y="0"/>
+                      <a:ext cx="6120000" cy="4250000"/>
+                    </a:xfrm>
+                    <a:prstGeom prst="rect"/>
+                  </pic:spPr>
+                </pic:pic>
+              </a:graphicData>
+            </a:graphic>
+          </wp:inline>
+        </w:drawing>
+      </w:r>
+    </w:p>
+    <w:tbl>
+      <w:tblPr>
+        <w:tblW w:type="auto" w:w="0"/>
+        <w:jc w:val="center"/>
+        <w:tblLayout w:type="fixed"/>
+        <w:tblLook w:firstColumn="1" w:firstRow="1" w:lastColumn="0" w:lastRow="0" w:noHBand="0" w:noVBand="1" w:val="04A0"/>
+      </w:tblPr>
+      <w:tblGrid>
+        <w:gridCol w:w="7569"/>
+        <w:gridCol w:w="7569"/>
+      </w:tblGrid>
+      <w:tr>
+        <w:trPr>
+          <w:tblHeader w:val="true"/>
+        </w:trPr>
+        <w:tc>
+          <w:tcPr>
+            <w:tcW w:type="dxa" w:w="7087"/>
+            <w:vAlign w:val="center"/>
+            <w:shd w:fill="F5F3F1"/>
+          </w:tcPr>
+          <w:p>
+            <w:pPr>
+              <w:spacing w:after="20"/>
+            </w:pPr>
+            <w:r>
+              <w:rPr>
+                <w:b/>
+                <w:color w:val="FF4B1F"/>
+              </w:rPr>
+              <w:t xml:space="preserve">1  </w:t>
+            </w:r>
+            <w:r>
+              <w:rPr>
+                <w:sz w:val="19"/>
+              </w:rPr>
+              <w:t>Переход между транспортом, пользователями и настройками.</w:t>
+            </w:r>
+          </w:p>
+        </w:tc>
+        <w:tc>
+          <w:tcPr>
+            <w:tcW w:type="dxa" w:w="7087"/>
+            <w:vAlign w:val="center"/>
+            <w:shd w:fill="F5F3F1"/>
+          </w:tcPr>
+          <w:p>
+            <w:pPr>
+              <w:spacing w:after="20"/>
+            </w:pPr>
+            <w:r>
+              <w:rPr>
+                <w:b/>
+                <w:color w:val="FF4B1F"/>
+              </w:rPr>
+              <w:t xml:space="preserve">4  </w:t>
+            </w:r>
+            <w:r>
+              <w:rPr>
+                <w:sz w:val="19"/>
+              </w:rPr>
+              <w:t>Выбор роли и создание пользователя.</w:t>
+            </w:r>
+          </w:p>
+        </w:tc>
+      </w:tr>
+      <w:tr>
+        <w:tc>
+          <w:tcPr>
+            <w:tcW w:type="dxa" w:w="7087"/>
+            <w:vAlign w:val="center"/>
+            <w:shd w:fill="F5F3F1"/>
+          </w:tcPr>
+          <w:p>
+            <w:pPr>
+              <w:spacing w:after="20"/>
+            </w:pPr>
+            <w:r>
+              <w:rPr>
+                <w:b/>
+                <w:color w:val="FF4B1F"/>
+              </w:rPr>
+              <w:t xml:space="preserve">2  </w:t>
+            </w:r>
+            <w:r>
+              <w:rPr>
+                <w:sz w:val="19"/>
+              </w:rPr>
+              <w:t>Поля для создания новой учётной записи.</w:t>
+            </w:r>
+          </w:p>
+        </w:tc>
+        <w:tc>
+          <w:tcPr>
+            <w:tcW w:type="dxa" w:w="7087"/>
+            <w:vAlign w:val="center"/>
+            <w:shd w:fill="F5F3F1"/>
+          </w:tcPr>
+          <w:p>
+            <w:pPr>
+              <w:spacing w:after="20"/>
+            </w:pPr>
+            <w:r>
+              <w:rPr>
+                <w:b/>
+                <w:color w:val="FF4B1F"/>
+              </w:rPr>
+              <w:t xml:space="preserve">5  </w:t>
+            </w:r>
+            <w:r>
+              <w:rPr>
+                <w:sz w:val="19"/>
+              </w:rPr>
+              <w:t>Список пользователей, их роли и состояние.</w:t>
+            </w:r>
+          </w:p>
+        </w:tc>
+      </w:tr>
+      <w:tr>
+        <w:tc>
+          <w:tcPr>
+            <w:tcW w:type="dxa" w:w="7087"/>
+            <w:vAlign w:val="center"/>
+            <w:shd w:fill="F5F3F1"/>
+          </w:tcPr>
+          <w:p>
+            <w:pPr>
+              <w:spacing w:after="20"/>
+            </w:pPr>
+            <w:r>
+              <w:rPr>
+                <w:b/>
+                <w:color w:val="FF4B1F"/>
+              </w:rPr>
+              <w:t xml:space="preserve">3  </w:t>
+            </w:r>
+            <w:r>
+              <w:rPr>
+                <w:sz w:val="19"/>
+              </w:rPr>
+              <w:t>Показать или скрыть вводимый пароль.</w:t>
+            </w:r>
+          </w:p>
+        </w:tc>
+        <w:tc>
+          <w:tcPr>
+            <w:tcW w:type="dxa" w:w="7087"/>
+            <w:vAlign w:val="center"/>
+            <w:shd w:fill="F5F3F1"/>
+          </w:tcPr>
+          <w:p>
+            <w:pPr>
+              <w:spacing w:after="20"/>
+            </w:pPr>
+            <w:r>
+              <w:rPr>
+                <w:b/>
+                <w:color w:val="FF4B1F"/>
+              </w:rPr>
+              <w:t xml:space="preserve">6  </w:t>
+            </w:r>
+            <w:r>
+              <w:rPr>
+                <w:sz w:val="19"/>
+              </w:rPr>
+              <w:t>Нажмите на строку пользователя, чтобы открыть действия.</w:t>
+            </w:r>
+          </w:p>
+        </w:tc>
+      </w:tr>
+    </w:tbl>
+    <w:p>
+      <w:r>
+        <w:br w:type="page"/>
+      </w:r>
+    </w:p>
+    <w:p>
+      <w:pPr>
+        <w:spacing w:after="80"/>
+      </w:pPr>
+      <w:r>
+        <w:rPr>
+          <w:rFonts w:ascii="Arial" w:hAnsi="Arial"/>
+          <w:b/>
+          <w:color w:val="FF4B1F"/>
+          <w:sz w:val="18"/>
+        </w:rPr>
+        <w:t>ИНСТРУКЦИЯ ДЛЯ АДМИНИСТРАТОРА</w:t>
+      </w:r>
+    </w:p>
+    <w:p>
+      <w:pPr>
+        <w:pStyle w:val="Heading1"/>
+      </w:pPr>
+      <w:r>
+        <w:t>Управление учётными записями</w:t>
+      </w:r>
+    </w:p>
+    <w:p>
+      <w:pPr>
+        <w:spacing w:after="180"/>
+        <w:pBdr>
+          <w:bottom w:val="single" w:sz="20" w:color="FF4B1F"/>
+        </w:pBdr>
+      </w:pPr>
+    </w:p>
+    <w:tbl>
+      <w:tblPr>
+        <w:tblW w:type="auto" w:w="0"/>
+        <w:jc w:val="center"/>
+        <w:tblLook w:firstColumn="1" w:firstRow="1" w:lastColumn="0" w:lastRow="0" w:noHBand="0" w:noVBand="1" w:val="04A0"/>
+      </w:tblPr>
+      <w:tblGrid>
+        <w:gridCol w:w="7569"/>
+        <w:gridCol w:w="7569"/>
+      </w:tblGrid>
+      <w:tr>
+        <w:trPr>
+          <w:tblHeader w:val="true"/>
+        </w:trPr>
+        <w:tc>
+          <w:tcPr>
+            <w:tcW w:type="dxa" w:w="7569"/>
+            <w:vAlign w:val="top"/>
+          </w:tcPr>
+          <w:p>
+            <w:r>
+              <w:drawing>
+                <wp:inline xmlns:a="http://schemas.openxmlformats.org/drawingml/2006/main" xmlns:pic="http://schemas.openxmlformats.org/drawingml/2006/picture">
+                  <wp:extent cx="4392000" cy="3050000"/>
+                  <wp:docPr id="3" name="Picture 3" descr="Модальное окно действий с пользователем со стрелками к смене пароля, отключению и закрытию." title="Модальное окно действий с пользователем со стрелками к смене пароля, отключению и закрытию."/>
+                  <wp:cNvGraphicFramePr>
+                    <a:graphicFrameLocks noChangeAspect="1"/>
+                  </wp:cNvGraphicFramePr>
+                  <a:graphic>
+                    <a:graphicData uri="http://schemas.openxmlformats.org/drawingml/2006/picture">
+                      <pic:pic>
+                        <pic:nvPicPr>
+                          <pic:cNvPr id="0" name="admin_actions_annotated.png"/>
+                          <pic:cNvPicPr/>
+                        </pic:nvPicPr>
+                        <pic:blipFill>
+                          <a:blip r:embed="rId11"/>
+                          <a:stretch>
+                            <a:fillRect/>
+                          </a:stretch>
+                        </pic:blipFill>
+                        <pic:spPr>
+                          <a:xfrm>
+                            <a:off x="0" y="0"/>
+                            <a:ext cx="4392000" cy="3050000"/>
+                          </a:xfrm>
+                          <a:prstGeom prst="rect"/>
+                        </pic:spPr>
+                      </pic:pic>
+                    </a:graphicData>
+                  </a:graphic>
+                </wp:inline>
+              </w:drawing>
+            </w:r>
+          </w:p>
+          <w:p>
+            <w:r>
+              <w:rPr>
+                <w:b/>
+                <w:color w:val="FF4B1F"/>
+              </w:rPr>
+              <w:t xml:space="preserve">1  </w:t>
+            </w:r>
+            <w:r>
+              <w:t>Изменить пароль пользователя.</w:t>
+            </w:r>
+          </w:p>
+          <w:p>
+            <w:r>
+              <w:rPr>
+                <w:b/>
+                <w:color w:val="FF4B1F"/>
+              </w:rPr>
+              <w:t xml:space="preserve">2  </w:t>
+            </w:r>
+            <w:r>
+              <w:t>Отключить или включить учётную запись.</w:t>
+            </w:r>
+          </w:p>
+          <w:p>
+            <w:r>
+              <w:rPr>
+                <w:b/>
+                <w:color w:val="FF4B1F"/>
+              </w:rPr>
+              <w:t xml:space="preserve">3  </w:t>
+            </w:r>
+            <w:r>
+              <w:t>Закрыть окно без изменений.</w:t>
+            </w:r>
+          </w:p>
+        </w:tc>
+        <w:tc>
+          <w:tcPr>
+            <w:tcW w:type="dxa" w:w="7569"/>
+            <w:vAlign w:val="top"/>
+          </w:tcPr>
+          <w:p>
+            <w:r>
+              <w:rPr>
+                <w:b/>
+                <w:color w:val="FF4B1F"/>
+                <w:sz w:val="30"/>
+              </w:rPr>
+              <w:t>Создать пользователя</w:t>
+            </w:r>
+          </w:p>
+          <w:p>
+            <w:pPr>
+              <w:spacing w:after="100"/>
+            </w:pPr>
+            <w:r>
+              <w:rPr>
+                <w:b/>
+                <w:color w:val="FF4B1F"/>
+              </w:rPr>
+              <w:t xml:space="preserve">1.  </w:t>
+            </w:r>
+            <w:r>
+              <w:t>Введите уникальный логин длиной от 3 до 64 символов.</w:t>
+            </w:r>
+          </w:p>
+          <w:p>
+            <w:pPr>
+              <w:spacing w:after="100"/>
+            </w:pPr>
+            <w:r>
+              <w:rPr>
+                <w:b/>
+                <w:color w:val="FF4B1F"/>
+              </w:rPr>
+              <w:t xml:space="preserve">2.  </w:t>
+            </w:r>
+            <w:r>
+              <w:t>Задайте пароль не короче 8 символов: буква, цифра и специальный символ.</w:t>
+            </w:r>
+          </w:p>
+          <w:p>
+            <w:pPr>
+              <w:spacing w:after="100"/>
+            </w:pPr>
+            <w:r>
+              <w:rPr>
+                <w:b/>
+                <w:color w:val="FF4B1F"/>
+              </w:rPr>
+              <w:t xml:space="preserve">3.  </w:t>
+            </w:r>
+            <w:r>
+              <w:t>Выберите роль Logist или Administrator и нажмите «Создать».</w:t>
+            </w:r>
+          </w:p>
+          <w:p>
+            <w:r>
+              <w:rPr>
+                <w:b/>
+                <w:color w:val="FF4B1F"/>
+                <w:sz w:val="30"/>
+              </w:rPr>
+              <w:t>Изменить доступ</w:t>
+            </w:r>
+          </w:p>
+          <w:p>
+            <w:pPr>
+              <w:spacing w:after="100"/>
+            </w:pPr>
+            <w:r>
+              <w:rPr>
+                <w:b/>
+                <w:color w:val="FF4B1F"/>
+              </w:rPr>
+              <w:t xml:space="preserve">1.  </w:t>
+            </w:r>
+            <w:r>
+              <w:t>Нажмите на строку пользователя.</w:t>
+            </w:r>
+          </w:p>
+          <w:p>
+            <w:pPr>
+              <w:spacing w:after="100"/>
+            </w:pPr>
+            <w:r>
+              <w:rPr>
+                <w:b/>
+                <w:color w:val="FF4B1F"/>
+              </w:rPr>
+              <w:t xml:space="preserve">2.  </w:t>
+            </w:r>
+            <w:r>
+              <w:t>Выберите смену пароля либо отключение/включение.</w:t>
+            </w:r>
+          </w:p>
+          <w:p>
+            <w:pPr>
+              <w:spacing w:after="100"/>
+            </w:pPr>
+            <w:r>
+              <w:rPr>
+                <w:b/>
+                <w:color w:val="FF4B1F"/>
+              </w:rPr>
+              <w:t xml:space="preserve">3.  </w:t>
+            </w:r>
+            <w:r>
+              <w:t>После смены пароля текущий вход пользователя завершится; далее нужен новый пароль.</w:t>
+            </w:r>
+          </w:p>
+          <w:p>
+            <w:r>
+              <w:rPr>
+                <w:b/>
+              </w:rPr>
+              <w:t>Важно: текущего администратора и последнего активного администратора отключить нельзя.</w:t>
+            </w:r>
+          </w:p>
+        </w:tc>
+      </w:tr>
+    </w:tbl>
+    <w:p>
+      <w:r>
+        <w:br w:type="page"/>
+      </w:r>
+    </w:p>
+    <w:p>
+      <w:pPr>
+        <w:spacing w:after="80"/>
+      </w:pPr>
+      <w:r>
+        <w:rPr>
+          <w:rFonts w:ascii="Arial" w:hAnsi="Arial"/>
+          <w:b/>
+          <w:color w:val="FF4B1F"/>
+          <w:sz w:val="18"/>
+        </w:rPr>
+        <w:t>ИНСТРУКЦИЯ ДЛЯ АДМИНИСТРАТОРА</w:t>
+      </w:r>
+    </w:p>
+    <w:p>
+      <w:pPr>
+        <w:pStyle w:val="Heading1"/>
+      </w:pPr>
+      <w:r>
+        <w:t>Настройки и частые ситуации</w:t>
+      </w:r>
+    </w:p>
+    <w:p>
+      <w:pPr>
+        <w:spacing w:after="180"/>
+        <w:pBdr>
+          <w:bottom w:val="single" w:sz="20" w:color="FF4B1F"/>
+        </w:pBdr>
+      </w:pPr>
+    </w:p>
+    <w:p>
+      <w:pPr>
+        <w:pStyle w:val="Heading2"/>
+      </w:pPr>
+      <w:r>
+        <w:t>Настройки водительского киоска</w:t>
+      </w:r>
+    </w:p>
+    <w:p>
+      <w:pPr>
+        <w:spacing w:after="100"/>
+      </w:pPr>
+      <w:r>
+        <w:rPr>
+          <w:b/>
+          <w:color w:val="FF4B1F"/>
+        </w:rPr>
+        <w:t xml:space="preserve">1.  </w:t>
       </w:r>
       <w:r>
-        <w:rPr>
-          <w:rFonts w:ascii="Arial" w:hAnsi="Arial" w:eastAsia="Arial"/>
-          <w:color w:val="292727"/>
-          <w:sz w:val="21"/>
-        </w:rPr>
-        <w:t>Войдите снова. Если проблема повторяется, обратитесь к ответственному за сервис.</w:t>
+        <w:t>Откройте вкладку «Настройки».</w:t>
       </w:r>
     </w:p>
+    <w:p>
+      <w:pPr>
+        <w:spacing w:after="100"/>
+      </w:pPr>
+      <w:r>
+        <w:rPr>
+          <w:b/>
+          <w:color w:val="FF4B1F"/>
+        </w:rPr>
+        <w:t xml:space="preserve">2.  </w:t>
+      </w:r>
+      <w:r>
+        <w:t>Выберите светлую или тёмную тему водительского экрана.</w:t>
+      </w:r>
+    </w:p>
+    <w:p>
+      <w:pPr>
+        <w:spacing w:after="100"/>
+      </w:pPr>
+      <w:r>
+        <w:rPr>
+          <w:b/>
+          <w:color w:val="FF4B1F"/>
+        </w:rPr>
+        <w:t xml:space="preserve">3.  </w:t>
+      </w:r>
+      <w:r>
+        <w:t>В блоке текстов выберите язык, измените заголовок и короткий текст под клавиатурой.</w:t>
+      </w:r>
+    </w:p>
+    <w:p>
+      <w:pPr>
+        <w:spacing w:after="100"/>
+      </w:pPr>
+      <w:r>
+        <w:rPr>
+          <w:b/>
+          <w:color w:val="FF4B1F"/>
+        </w:rPr>
+        <w:t xml:space="preserve">4.  </w:t>
+      </w:r>
+      <w:r>
+        <w:t>Нажмите «Сохранить тексты». Каждый язык настраивается отдельно.</w:t>
+      </w:r>
+    </w:p>
+    <w:p>
+      <w:pPr>
+        <w:pStyle w:val="Heading2"/>
+      </w:pPr>
+      <w:r>
+        <w:t>Если что-то не получается</w:t>
+      </w:r>
+    </w:p>
+    <w:tbl>
+      <w:tblPr>
+        <w:tblW w:type="auto" w:w="0"/>
+        <w:jc w:val="center"/>
+        <w:tblLook w:firstColumn="1" w:firstRow="1" w:lastColumn="0" w:lastRow="0" w:noHBand="0" w:noVBand="1" w:val="04A0"/>
+      </w:tblPr>
+      <w:tblGrid>
+        <w:gridCol w:w="7569"/>
+        <w:gridCol w:w="7569"/>
+      </w:tblGrid>
+      <w:tr>
+        <w:trPr>
+          <w:tblHeader w:val="true"/>
+        </w:trPr>
+        <w:tc>
+          <w:tcPr>
+            <w:tcW w:type="dxa" w:w="7569"/>
+            <w:shd w:fill="F5F3F1"/>
+            <w:vAlign w:val="center"/>
+          </w:tcPr>
+          <w:p>
+            <w:r>
+              <w:rPr>
+                <w:b/>
+              </w:rPr>
+              <w:t>Запись не найдена</w:t>
+            </w:r>
+          </w:p>
+        </w:tc>
+        <w:tc>
+          <w:tcPr>
+            <w:tcW w:type="dxa" w:w="7569"/>
+            <w:vAlign w:val="center"/>
+          </w:tcPr>
+          <w:p>
+            <w:r>
+              <w:t>Сбросьте фильтры и проверьте режимы «Активные», «Скрытые» и «Все».</w:t>
+            </w:r>
+          </w:p>
+        </w:tc>
+      </w:tr>
+      <w:tr>
+        <w:tc>
+          <w:tcPr>
+            <w:tcW w:type="dxa" w:w="7569"/>
+            <w:shd w:fill="F5F3F1"/>
+            <w:vAlign w:val="center"/>
+          </w:tcPr>
+          <w:p>
+            <w:r>
+              <w:rPr>
+                <w:b/>
+              </w:rPr>
+              <w:t>Пользователь не входит</w:t>
+            </w:r>
+          </w:p>
+        </w:tc>
+        <w:tc>
+          <w:tcPr>
+            <w:tcW w:type="dxa" w:w="7569"/>
+            <w:vAlign w:val="center"/>
+          </w:tcPr>
+          <w:p>
+            <w:r>
+              <w:t>Проверьте его состояние. При необходимости включите учётную запись или задайте новый пароль.</w:t>
+            </w:r>
+          </w:p>
+        </w:tc>
+      </w:tr>
+      <w:tr>
+        <w:tc>
+          <w:tcPr>
+            <w:tcW w:type="dxa" w:w="7569"/>
+            <w:shd w:fill="F5F3F1"/>
+            <w:vAlign w:val="center"/>
+          </w:tcPr>
+          <w:p>
+            <w:r>
+              <w:rPr>
+                <w:b/>
+              </w:rPr>
+              <w:t>Пароль не сохраняется</w:t>
+            </w:r>
+          </w:p>
+        </w:tc>
+        <w:tc>
+          <w:tcPr>
+            <w:tcW w:type="dxa" w:w="7569"/>
+            <w:vAlign w:val="center"/>
+          </w:tcPr>
+          <w:p>
+            <w:r>
+              <w:t>Проверьте: не менее 8 символов, есть буква, цифра и специальный символ.</w:t>
+            </w:r>
+          </w:p>
+        </w:tc>
+      </w:tr>
+      <w:tr>
+        <w:tc>
+          <w:tcPr>
+            <w:tcW w:type="dxa" w:w="7569"/>
+            <w:shd w:fill="F5F3F1"/>
+            <w:vAlign w:val="center"/>
+          </w:tcPr>
+          <w:p>
+            <w:r>
+              <w:rPr>
+                <w:b/>
+              </w:rPr>
+              <w:t>Кабинет вернул на вход</w:t>
+            </w:r>
+          </w:p>
+        </w:tc>
+        <w:tc>
+          <w:tcPr>
+            <w:tcW w:type="dxa" w:w="7569"/>
+            <w:vAlign w:val="center"/>
+          </w:tcPr>
+          <w:p>
+            <w:r>
+              <w:t>Войдите снова. Если ситуация повторяется, обратитесь к ответственному за сервис.</w:t>
+            </w:r>
+          </w:p>
+        </w:tc>
+      </w:tr>
+    </w:tbl>
     <w:sectPr>
-      <w:footerReference w:type="default" r:id="rId9"/>
-      <w:pgSz w:w="12240" w:h="15840"/>
-      <w:pgMar w:top="979" w:right="1037" w:bottom="893" w:left="1037" w:header="720" w:footer="403" w:gutter="0"/>
+      <w:footerReference w:type="default" r:id="rId12"/>
+      <w:pgSz w:w="16838" w:h="11906" w:orient="landscape"/>
+      <w:pgMar w:top="709" w:right="850" w:bottom="652" w:left="850" w:header="720" w:footer="720" w:gutter="0"/>
       <w:cols w:space="720"/>
       <w:docGrid w:linePitch="360"/>
     </w:sectPr>
@@ -1428,22 +1422,12 @@
     </w:pPr>
     <w:r>
       <w:rPr>
-        <w:rFonts w:ascii="Arial" w:hAnsi="Arial" w:eastAsia="Arial"/>
-        <w:color w:val="6F6B69"/>
-        <w:sz w:val="17"/>
-      </w:rPr>
-      <w:t xml:space="preserve">Сервис пропусков ЗТЗ    Страница </w:t>
+        <w:color w:val="696969"/>
+        <w:sz w:val="16"/>
+      </w:rPr>
+      <w:t xml:space="preserve">Пользовательская инструкция  •  </w:t>
     </w:r>
-    <w:r>
-      <w:rPr>
-        <w:rFonts w:ascii="Arial" w:hAnsi="Arial" w:eastAsia="Arial"/>
-        <w:color w:val="6F6B69"/>
-        <w:sz w:val="17"/>
-      </w:rPr>
-      <w:fldChar w:fldCharType="begin"/>
-      <w:instrText xml:space="preserve"> PAGE </w:instrText>
-      <w:fldChar w:fldCharType="end"/>
-    </w:r>
+    <w:fldSimple w:instr="PAGE"/>
   </w:p>
 </w:ftr>
 </file>
@@ -1812,11 +1796,11 @@
     <w:qFormat/>
     <w:rsid w:val="00FC693F"/>
     <w:pPr>
-      <w:spacing w:after="120" w:line="269" w:lineRule="auto"/>
+      <w:spacing w:after="100"/>
     </w:pPr>
     <w:rPr>
       <w:rFonts w:ascii="Arial" w:hAnsi="Arial" w:eastAsia="Arial"/>
-      <w:color w:val="292727"/>
+      <w:color w:val="232121"/>
       <w:sz w:val="21"/>
     </w:rPr>
   </w:style>
@@ -1875,15 +1859,15 @@
     <w:pPr>
       <w:keepNext/>
       <w:keepLines/>
-      <w:spacing w:before="300" w:after="140"/>
+      <w:spacing w:before="120" w:after="160"/>
       <w:outlineLvl w:val="0"/>
     </w:pPr>
     <w:rPr>
       <w:rFonts w:asciiTheme="majorHAnsi" w:eastAsiaTheme="majorEastAsia" w:hAnsiTheme="majorHAnsi" w:cstheme="majorBidi" w:ascii="Arial" w:hAnsi="Arial" w:eastAsia="Arial"/>
       <w:b/>
       <w:bCs/>
-      <w:color w:val="000000"/>
-      <w:sz w:val="34"/>
+      <w:color w:val="232121"/>
+      <w:sz w:val="44"/>
       <w:szCs w:val="28"/>
     </w:rPr>
   </w:style>
@@ -1899,15 +1883,15 @@
     <w:pPr>
       <w:keepNext/>
       <w:keepLines/>
-      <w:spacing w:before="200" w:after="100"/>
+      <w:spacing w:before="120" w:after="160"/>
       <w:outlineLvl w:val="1"/>
     </w:pPr>
     <w:rPr>
       <w:rFonts w:asciiTheme="majorHAnsi" w:eastAsiaTheme="majorEastAsia" w:hAnsiTheme="majorHAnsi" w:cstheme="majorBidi" w:ascii="Arial" w:hAnsi="Arial" w:eastAsia="Arial"/>
       <w:b/>
       <w:bCs/>
-      <w:color w:val="000000"/>
-      <w:sz w:val="25"/>
+      <w:color w:val="FF4B1F"/>
+      <w:sz w:val="30"/>
       <w:szCs w:val="26"/>
     </w:rPr>
   </w:style>
@@ -2161,16 +2145,19 @@
     <w:qFormat/>
     <w:rsid w:val="00FC693F"/>
     <w:pPr>
-      <w:spacing w:after="140" w:line="240" w:lineRule="auto"/>
+      <w:pBdr>
+        <w:bottom w:val="single" w:sz="8" w:space="4" w:color="4F81BD" w:themeColor="accent1"/>
+      </w:pBdr>
+      <w:spacing w:after="160" w:line="240" w:lineRule="auto" w:before="120"/>
       <w:contextualSpacing/>
     </w:pPr>
     <w:rPr>
       <w:rFonts w:asciiTheme="majorHAnsi" w:eastAsiaTheme="majorEastAsia" w:hAnsiTheme="majorHAnsi" w:cstheme="majorBidi" w:ascii="Arial" w:hAnsi="Arial" w:eastAsia="Arial"/>
       <w:b/>
-      <w:color w:val="000000"/>
+      <w:color w:val="232121"/>
       <w:spacing w:val="5"/>
       <w:kern w:val="28"/>
-      <w:sz w:val="52"/>
+      <w:sz w:val="60"/>
       <w:szCs w:val="52"/>
     </w:rPr>
   </w:style>

</xml_diff>

<commit_message>
docs: refine guide screenshot callouts
</commit_message>
<xml_diff>
--- a/project_files/deliverables/Инструкция_для_логистов_и_администраторов.docx
+++ b/project_files/deliverables/Инструкция_для_логистов_и_администраторов.docx
@@ -280,7 +280,7 @@
       <w:r>
         <w:drawing>
           <wp:inline xmlns:a="http://schemas.openxmlformats.org/drawingml/2006/main" xmlns:pic="http://schemas.openxmlformats.org/drawingml/2006/picture">
-            <wp:extent cx="6120000" cy="4250000"/>
+            <wp:extent cx="6120000" cy="4350361"/>
             <wp:docPr id="1" name="Picture 1" descr="Экран логиста «Транспорт» с шестью стрелками к основным элементам управления." title="Экран логиста «Транспорт» с шестью стрелками к основным элементам управления."/>
             <wp:cNvGraphicFramePr>
               <a:graphicFrameLocks noChangeAspect="1"/>
@@ -301,7 +301,7 @@
                   <pic:spPr>
                     <a:xfrm>
                       <a:off x="0" y="0"/>
-                      <a:ext cx="6120000" cy="4250000"/>
+                      <a:ext cx="6120000" cy="4350361"/>
                     </a:xfrm>
                     <a:prstGeom prst="rect"/>
                   </pic:spPr>
@@ -709,7 +709,7 @@
       <w:r>
         <w:drawing>
           <wp:inline xmlns:a="http://schemas.openxmlformats.org/drawingml/2006/main" xmlns:pic="http://schemas.openxmlformats.org/drawingml/2006/picture">
-            <wp:extent cx="6120000" cy="4250000"/>
+            <wp:extent cx="6120000" cy="4350361"/>
             <wp:docPr id="2" name="Picture 2" descr="Экран администратора «Пользователи» с шестью стрелками к форме и списку." title="Экран администратора «Пользователи» с шестью стрелками к форме и списку."/>
             <wp:cNvGraphicFramePr>
               <a:graphicFrameLocks noChangeAspect="1"/>
@@ -730,7 +730,7 @@
                   <pic:spPr>
                     <a:xfrm>
                       <a:off x="0" y="0"/>
-                      <a:ext cx="6120000" cy="4250000"/>
+                      <a:ext cx="6120000" cy="4350361"/>
                     </a:xfrm>
                     <a:prstGeom prst="rect"/>
                   </pic:spPr>
@@ -970,7 +970,7 @@
             <w:r>
               <w:drawing>
                 <wp:inline xmlns:a="http://schemas.openxmlformats.org/drawingml/2006/main" xmlns:pic="http://schemas.openxmlformats.org/drawingml/2006/picture">
-                  <wp:extent cx="4392000" cy="3050000"/>
+                  <wp:extent cx="4392000" cy="3122024"/>
                   <wp:docPr id="3" name="Picture 3" descr="Модальное окно действий с пользователем со стрелками к смене пароля, отключению и закрытию." title="Модальное окно действий с пользователем со стрелками к смене пароля, отключению и закрытию."/>
                   <wp:cNvGraphicFramePr>
                     <a:graphicFrameLocks noChangeAspect="1"/>
@@ -991,7 +991,7 @@
                         <pic:spPr>
                           <a:xfrm>
                             <a:off x="0" y="0"/>
-                            <a:ext cx="4392000" cy="3050000"/>
+                            <a:ext cx="4392000" cy="3122024"/>
                           </a:xfrm>
                           <a:prstGeom prst="rect"/>
                         </pic:spPr>

</xml_diff>

<commit_message>
docs: expand administrator settings guide
</commit_message>
<xml_diff>
--- a/project_files/deliverables/Инструкция_для_логистов_и_администраторов.docx
+++ b/project_files/deliverables/Инструкция_для_логистов_и_администраторов.docx
@@ -1205,7 +1205,7 @@
         <w:pStyle w:val="Heading2"/>
       </w:pPr>
       <w:r>
-        <w:t>Настройки водительского киоска</w:t>
+        <w:t>Включить тему водительского экрана</w:t>
       </w:r>
     </w:p>
     <w:p>
@@ -1220,7 +1220,7 @@
         <w:t xml:space="preserve">1.  </w:t>
       </w:r>
       <w:r>
-        <w:t>Откройте вкладку «Настройки».</w:t>
+        <w:t>Откройте вкладку «Настройки» в кабинете администратора.</w:t>
       </w:r>
     </w:p>
     <w:p>
@@ -1235,7 +1235,7 @@
         <w:t xml:space="preserve">2.  </w:t>
       </w:r>
       <w:r>
-        <w:t>Выберите светлую или тёмную тему водительского экрана.</w:t>
+        <w:t>В блоке темы выберите «Светлая» или «Тёмная». Выбранное оформление будет применяться к публичной странице водителя.</w:t>
       </w:r>
     </w:p>
     <w:p>
@@ -1250,7 +1250,60 @@
         <w:t xml:space="preserve">3.  </w:t>
       </w:r>
       <w:r>
-        <w:t>В блоке текстов выберите язык, измените заголовок и короткий текст под клавиатурой.</w:t>
+        <w:t>Откройте водительскую страницу и убедитесь, что фон, карточки и кнопки выглядят как задумано.</w:t>
+      </w:r>
+    </w:p>
+    <w:p>
+      <w:pPr>
+        <w:pStyle w:val="Heading2"/>
+      </w:pPr>
+      <w:r>
+        <w:t>Изменить надписи на странице водителя</w:t>
+      </w:r>
+    </w:p>
+    <w:p>
+      <w:pPr>
+        <w:spacing w:after="100"/>
+      </w:pPr>
+      <w:r>
+        <w:rPr>
+          <w:b/>
+          <w:color w:val="FF4B1F"/>
+        </w:rPr>
+        <w:t xml:space="preserve">1.  </w:t>
+      </w:r>
+      <w:r>
+        <w:t>В блоке текстов выберите язык, для которого нужно внести изменения. Каждый язык настраивается отдельно.</w:t>
+      </w:r>
+    </w:p>
+    <w:p>
+      <w:pPr>
+        <w:spacing w:after="100"/>
+      </w:pPr>
+      <w:r>
+        <w:rPr>
+          <w:b/>
+          <w:color w:val="FF4B1F"/>
+        </w:rPr>
+        <w:t xml:space="preserve">2.  </w:t>
+      </w:r>
+      <w:r>
+        <w:t>В поле верхней надписи укажите короткий заголовок над формой, например «Введите номер автомобиля».</w:t>
+      </w:r>
+    </w:p>
+    <w:p>
+      <w:pPr>
+        <w:spacing w:after="100"/>
+      </w:pPr>
+      <w:r>
+        <w:rPr>
+          <w:b/>
+          <w:color w:val="FF4B1F"/>
+        </w:rPr>
+        <w:t xml:space="preserve">3.  </w:t>
+      </w:r>
+      <w:r>
+        <w:t>В поле текста под клавиатурой напишите короткую подсказку, которая будет показана под экранной клавиатурой; лучше уложить её в две строки.</w:t>
       </w:r>
     </w:p>
     <w:p>
@@ -1265,7 +1318,15 @@
         <w:t xml:space="preserve">4.  </w:t>
       </w:r>
       <w:r>
-        <w:t>Нажмите «Сохранить тексты». Каждый язык настраивается отдельно.</w:t>
+        <w:t>Нажмите «Сохранить тексты», затем откройте водительскую страницу и проверьте верхнюю надпись и текст под клавиатурой.</w:t>
+      </w:r>
+    </w:p>
+    <w:p>
+      <w:r>
+        <w:rPr>
+          <w:i/>
+        </w:rPr>
+        <w:t>Если нужно изменить текст для другого языка, повторите эти действия после выбора нужного языка.</w:t>
       </w:r>
     </w:p>
     <w:p>

</xml_diff>

<commit_message>
docs: add annotated settings screenshot
</commit_message>
<xml_diff>
--- a/project_files/deliverables/Инструкция_для_логистов_и_администраторов.docx
+++ b/project_files/deliverables/Инструкция_для_логистов_и_администраторов.docx
@@ -1202,6 +1202,197 @@
     </w:p>
     <w:p>
       <w:pPr>
+        <w:jc w:val="center"/>
+      </w:pPr>
+      <w:r>
+        <w:drawing>
+          <wp:inline xmlns:a="http://schemas.openxmlformats.org/drawingml/2006/main" xmlns:pic="http://schemas.openxmlformats.org/drawingml/2006/picture">
+            <wp:extent cx="5760000" cy="2880000"/>
+            <wp:docPr id="4" name="Picture 4" descr="Экран настроек администратора со стрелками к теме, языку, верхней надписи, тексту под клавиатурой и сохранению." title="Экран настроек администратора со стрелками к теме, языку, верхней надписи, тексту под клавиатурой и сохранению."/>
+            <wp:cNvGraphicFramePr>
+              <a:graphicFrameLocks noChangeAspect="1"/>
+            </wp:cNvGraphicFramePr>
+            <a:graphic>
+              <a:graphicData uri="http://schemas.openxmlformats.org/drawingml/2006/picture">
+                <pic:pic>
+                  <pic:nvPicPr>
+                    <pic:cNvPr id="0" name="settings_annotated.png"/>
+                    <pic:cNvPicPr/>
+                  </pic:nvPicPr>
+                  <pic:blipFill>
+                    <a:blip r:embed="rId12"/>
+                    <a:stretch>
+                      <a:fillRect/>
+                    </a:stretch>
+                  </pic:blipFill>
+                  <pic:spPr>
+                    <a:xfrm>
+                      <a:off x="0" y="0"/>
+                      <a:ext cx="5760000" cy="2880000"/>
+                    </a:xfrm>
+                    <a:prstGeom prst="rect"/>
+                  </pic:spPr>
+                </pic:pic>
+              </a:graphicData>
+            </a:graphic>
+          </wp:inline>
+        </w:drawing>
+      </w:r>
+    </w:p>
+    <w:tbl>
+      <w:tblPr>
+        <w:tblW w:type="auto" w:w="0"/>
+        <w:jc w:val="center"/>
+        <w:tblLayout w:type="fixed"/>
+        <w:tblLook w:firstColumn="1" w:firstRow="1" w:lastColumn="0" w:lastRow="0" w:noHBand="0" w:noVBand="1" w:val="04A0"/>
+      </w:tblPr>
+      <w:tblGrid>
+        <w:gridCol w:w="7569"/>
+        <w:gridCol w:w="7569"/>
+      </w:tblGrid>
+      <w:tr>
+        <w:trPr>
+          <w:tblHeader w:val="true"/>
+        </w:trPr>
+        <w:tc>
+          <w:tcPr>
+            <w:tcW w:type="dxa" w:w="7087"/>
+            <w:vAlign w:val="center"/>
+            <w:shd w:fill="F5F3F1"/>
+          </w:tcPr>
+          <w:p>
+            <w:pPr>
+              <w:spacing w:after="20"/>
+            </w:pPr>
+            <w:r>
+              <w:rPr>
+                <w:b/>
+                <w:color w:val="FF4B1F"/>
+              </w:rPr>
+              <w:t xml:space="preserve">1  </w:t>
+            </w:r>
+            <w:r>
+              <w:rPr>
+                <w:sz w:val="19"/>
+              </w:rPr>
+              <w:t>Тема водительского киоска: светлое или тёмное оформление.</w:t>
+            </w:r>
+          </w:p>
+        </w:tc>
+        <w:tc>
+          <w:tcPr>
+            <w:tcW w:type="dxa" w:w="7087"/>
+            <w:vAlign w:val="center"/>
+            <w:shd w:fill="F5F3F1"/>
+          </w:tcPr>
+          <w:p>
+            <w:pPr>
+              <w:spacing w:after="20"/>
+            </w:pPr>
+            <w:r>
+              <w:rPr>
+                <w:b/>
+                <w:color w:val="FF4B1F"/>
+              </w:rPr>
+              <w:t xml:space="preserve">4  </w:t>
+            </w:r>
+            <w:r>
+              <w:rPr>
+                <w:sz w:val="19"/>
+              </w:rPr>
+              <w:t>Текст-подсказка под экранной клавиатурой.</w:t>
+            </w:r>
+          </w:p>
+        </w:tc>
+      </w:tr>
+      <w:tr>
+        <w:tc>
+          <w:tcPr>
+            <w:tcW w:type="dxa" w:w="7087"/>
+            <w:vAlign w:val="center"/>
+            <w:shd w:fill="F5F3F1"/>
+          </w:tcPr>
+          <w:p>
+            <w:pPr>
+              <w:spacing w:after="20"/>
+            </w:pPr>
+            <w:r>
+              <w:rPr>
+                <w:b/>
+                <w:color w:val="FF4B1F"/>
+              </w:rPr>
+              <w:t xml:space="preserve">2  </w:t>
+            </w:r>
+            <w:r>
+              <w:rPr>
+                <w:sz w:val="19"/>
+              </w:rPr>
+              <w:t>Язык, для которого редактируются тексты.</w:t>
+            </w:r>
+          </w:p>
+        </w:tc>
+        <w:tc>
+          <w:tcPr>
+            <w:tcW w:type="dxa" w:w="7087"/>
+            <w:vAlign w:val="center"/>
+            <w:shd w:fill="F5F3F1"/>
+          </w:tcPr>
+          <w:p>
+            <w:pPr>
+              <w:spacing w:after="20"/>
+            </w:pPr>
+            <w:r>
+              <w:rPr>
+                <w:b/>
+                <w:color w:val="FF4B1F"/>
+              </w:rPr>
+              <w:t xml:space="preserve">5  </w:t>
+            </w:r>
+            <w:r>
+              <w:rPr>
+                <w:sz w:val="19"/>
+              </w:rPr>
+              <w:t>Сохранение изменений.</w:t>
+            </w:r>
+          </w:p>
+        </w:tc>
+      </w:tr>
+      <w:tr>
+        <w:tc>
+          <w:tcPr>
+            <w:tcW w:type="dxa" w:w="7087"/>
+            <w:vAlign w:val="center"/>
+            <w:shd w:fill="F5F3F1"/>
+          </w:tcPr>
+          <w:p>
+            <w:pPr>
+              <w:spacing w:after="20"/>
+            </w:pPr>
+            <w:r>
+              <w:rPr>
+                <w:b/>
+                <w:color w:val="FF4B1F"/>
+              </w:rPr>
+              <w:t xml:space="preserve">3  </w:t>
+            </w:r>
+            <w:r>
+              <w:rPr>
+                <w:sz w:val="19"/>
+              </w:rPr>
+              <w:t>Верхняя надпись над формой номера автомобиля.</w:t>
+            </w:r>
+          </w:p>
+        </w:tc>
+        <w:tc>
+          <w:tcPr>
+            <w:tcW w:type="dxa" w:w="7569"/>
+          </w:tcPr>
+          <w:p/>
+        </w:tc>
+      </w:tr>
+    </w:tbl>
+    <w:p>
+      <w:pPr>
         <w:pStyle w:val="Heading2"/>
       </w:pPr>
       <w:r>
@@ -1251,6 +1442,11 @@
       </w:r>
       <w:r>
         <w:t>Откройте водительскую страницу и убедитесь, что фон, карточки и кнопки выглядят как задумано.</w:t>
+      </w:r>
+    </w:p>
+    <w:p>
+      <w:r>
+        <w:br w:type="page"/>
       </w:r>
     </w:p>
     <w:p>
@@ -1464,7 +1660,7 @@
       </w:tr>
     </w:tbl>
     <w:sectPr>
-      <w:footerReference w:type="default" r:id="rId12"/>
+      <w:footerReference w:type="default" r:id="rId13"/>
       <w:pgSz w:w="16838" w:h="11906" w:orient="landscape"/>
       <w:pgMar w:top="709" w:right="850" w:bottom="652" w:left="850" w:header="720" w:footer="720" w:gutter="0"/>
       <w:cols w:space="720"/>

</xml_diff>

<commit_message>
docs: clarify admin language editing
</commit_message>
<xml_diff>
--- a/project_files/deliverables/Инструкция_для_логистов_и_администраторов.docx
+++ b/project_files/deliverables/Инструкция_для_логистов_и_администраторов.docx
@@ -1327,7 +1327,7 @@
               <w:rPr>
                 <w:sz w:val="19"/>
               </w:rPr>
-              <w:t>Язык, для которого редактируются тексты.</w:t>
+              <w:t>Язык, для которого редактируются тексты; выбор водителя не меняется.</w:t>
             </w:r>
           </w:p>
         </w:tc>
@@ -1523,6 +1523,14 @@
           <w:i/>
         </w:rPr>
         <w:t>Если нужно изменить текст для другого языка, повторите эти действия после выбора нужного языка.</w:t>
+      </w:r>
+    </w:p>
+    <w:p>
+      <w:r>
+        <w:rPr>
+          <w:b/>
+        </w:rPr>
+        <w:t>Важно: поле «Язык текста» в админке переключает только редактируемую версию. На водительском экране язык выбирает сам водитель; для выбранного языка отображаются соответствующие сохранённые тексты.</w:t>
       </w:r>
     </w:p>
     <w:p>

</xml_diff>

<commit_message>
feat: simplify administrator kiosk text settings
</commit_message>
<xml_diff>
--- a/project_files/deliverables/Инструкция_для_логистов_и_администраторов.docx
+++ b/project_files/deliverables/Инструкция_для_логистов_и_администраторов.docx
@@ -1208,7 +1208,7 @@
         <w:drawing>
           <wp:inline xmlns:a="http://schemas.openxmlformats.org/drawingml/2006/main" xmlns:pic="http://schemas.openxmlformats.org/drawingml/2006/picture">
             <wp:extent cx="5760000" cy="2880000"/>
-            <wp:docPr id="4" name="Picture 4" descr="Экран настроек администратора со стрелками к теме, языку, верхней надписи, тексту под клавиатурой и сохранению." title="Экран настроек администратора со стрелками к теме, языку, верхней надписи, тексту под клавиатурой и сохранению."/>
+            <wp:docPr id="4" name="Picture 4" descr="Экран настроек администратора со стрелками к теме, верхней надписи, тексту под клавиатурой и сохранению." title="Экран настроек администратора со стрелками к теме, верхней надписи, тексту под клавиатурой и сохранению."/>
             <wp:cNvGraphicFramePr>
               <a:graphicFrameLocks noChangeAspect="1"/>
             </wp:cNvGraphicFramePr>
@@ -1294,7 +1294,7 @@
                 <w:b/>
                 <w:color w:val="FF4B1F"/>
               </w:rPr>
-              <w:t xml:space="preserve">4  </w:t>
+              <w:t xml:space="preserve">3  </w:t>
             </w:r>
             <w:r>
               <w:rPr>
@@ -1327,7 +1327,7 @@
               <w:rPr>
                 <w:sz w:val="19"/>
               </w:rPr>
-              <w:t>Язык, для которого редактируются тексты; выбор водителя не меняется.</w:t>
+              <w:t>Верхняя надпись над формой номера автомобиля.</w:t>
             </w:r>
           </w:p>
         </w:tc>
@@ -1346,7 +1346,7 @@
                 <w:b/>
                 <w:color w:val="FF4B1F"/>
               </w:rPr>
-              <w:t xml:space="preserve">5  </w:t>
+              <w:t xml:space="preserve">4  </w:t>
             </w:r>
             <w:r>
               <w:rPr>
@@ -1355,39 +1355,6 @@
               <w:t>Сохранение изменений.</w:t>
             </w:r>
           </w:p>
-        </w:tc>
-      </w:tr>
-      <w:tr>
-        <w:tc>
-          <w:tcPr>
-            <w:tcW w:type="dxa" w:w="7087"/>
-            <w:vAlign w:val="center"/>
-            <w:shd w:fill="F5F3F1"/>
-          </w:tcPr>
-          <w:p>
-            <w:pPr>
-              <w:spacing w:after="20"/>
-            </w:pPr>
-            <w:r>
-              <w:rPr>
-                <w:b/>
-                <w:color w:val="FF4B1F"/>
-              </w:rPr>
-              <w:t xml:space="preserve">3  </w:t>
-            </w:r>
-            <w:r>
-              <w:rPr>
-                <w:sz w:val="19"/>
-              </w:rPr>
-              <w:t>Верхняя надпись над формой номера автомобиля.</w:t>
-            </w:r>
-          </w:p>
-        </w:tc>
-        <w:tc>
-          <w:tcPr>
-            <w:tcW w:type="dxa" w:w="7569"/>
-          </w:tcPr>
-          <w:p/>
         </w:tc>
       </w:tr>
     </w:tbl>
@@ -1469,7 +1436,7 @@
         <w:t xml:space="preserve">1.  </w:t>
       </w:r>
       <w:r>
-        <w:t>В блоке текстов выберите язык, для которого нужно внести изменения. Каждый язык настраивается отдельно.</w:t>
+        <w:t>В поле верхней надписи укажите короткий заголовок над формой, например «Введите номер автомобиля».</w:t>
       </w:r>
     </w:p>
     <w:p>
@@ -1484,7 +1451,7 @@
         <w:t xml:space="preserve">2.  </w:t>
       </w:r>
       <w:r>
-        <w:t>В поле верхней надписи укажите короткий заголовок над формой, например «Введите номер автомобиля».</w:t>
+        <w:t>В поле текста под клавиатурой напишите короткую подсказку, которая будет показана под экранной клавиатурой; лучше уложить её в две строки.</w:t>
       </w:r>
     </w:p>
     <w:p>
@@ -1499,21 +1466,6 @@
         <w:t xml:space="preserve">3.  </w:t>
       </w:r>
       <w:r>
-        <w:t>В поле текста под клавиатурой напишите короткую подсказку, которая будет показана под экранной клавиатурой; лучше уложить её в две строки.</w:t>
-      </w:r>
-    </w:p>
-    <w:p>
-      <w:pPr>
-        <w:spacing w:after="100"/>
-      </w:pPr>
-      <w:r>
-        <w:rPr>
-          <w:b/>
-          <w:color w:val="FF4B1F"/>
-        </w:rPr>
-        <w:t xml:space="preserve">4.  </w:t>
-      </w:r>
-      <w:r>
         <w:t>Нажмите «Сохранить тексты», затем откройте водительскую страницу и проверьте верхнюю надпись и текст под клавиатурой.</w:t>
       </w:r>
     </w:p>
@@ -1522,15 +1474,7 @@
         <w:rPr>
           <w:i/>
         </w:rPr>
-        <w:t>Если нужно изменить текст для другого языка, повторите эти действия после выбора нужного языка.</w:t>
-      </w:r>
-    </w:p>
-    <w:p>
-      <w:r>
-        <w:rPr>
-          <w:b/>
-        </w:rPr>
-        <w:t>Важно: поле «Язык текста» в админке переключает только редактируемую версию. На водительском экране язык выбирает сам водитель; для выбранного языка отображаются соответствующие сохранённые тексты.</w:t>
+        <w:t>Язык на публичной странице выбирает сам водитель.</w:t>
       </w:r>
     </w:p>
     <w:p>

</xml_diff>